<commit_message>
docs(language): refine L6 guide write-up wording
</commit_message>
<xml_diff>
--- a/handout/L6_student_guide_exam_aligned.docx
+++ b/handout/L6_student_guide_exam_aligned.docx
@@ -19,6 +19,14 @@
         <w:gridCol w:w="9866"/>
       </w:tblGrid>
       <w:tr>
+        <w:tblPrEx>
+          <w:tblCellMar>
+            <w:top w:w="0" w:type="dxa"/>
+            <w:left w:w="108" w:type="dxa"/>
+            <w:bottom w:w="0" w:type="dxa"/>
+            <w:right w:w="108" w:type="dxa"/>
+          </w:tblCellMar>
+        </w:tblPrEx>
         <w:trPr>
           <w:jc w:val="center"/>
         </w:trPr>
@@ -92,6 +100,14 @@
         <w:gridCol w:w="2466"/>
       </w:tblGrid>
       <w:tr>
+        <w:tblPrEx>
+          <w:tblCellMar>
+            <w:top w:w="0" w:type="dxa"/>
+            <w:left w:w="108" w:type="dxa"/>
+            <w:bottom w:w="0" w:type="dxa"/>
+            <w:right w:w="108" w:type="dxa"/>
+          </w:tblCellMar>
+        </w:tblPrEx>
         <w:trPr>
           <w:jc w:val="center"/>
         </w:trPr>
@@ -346,6 +362,14 @@
         <w:gridCol w:w="9866"/>
       </w:tblGrid>
       <w:tr>
+        <w:tblPrEx>
+          <w:tblCellMar>
+            <w:top w:w="0" w:type="dxa"/>
+            <w:left w:w="108" w:type="dxa"/>
+            <w:bottom w:w="0" w:type="dxa"/>
+            <w:right w:w="108" w:type="dxa"/>
+          </w:tblCellMar>
+        </w:tblPrEx>
         <w:trPr>
           <w:jc w:val="center"/>
         </w:trPr>
@@ -605,6 +629,12 @@
             <w:insideH w:val="single" w:color="auto" w:sz="4" w:space="0"/>
             <w:insideV w:val="single" w:color="auto" w:sz="4" w:space="0"/>
           </w:tblBorders>
+          <w:tblCellMar>
+            <w:top w:w="0" w:type="dxa"/>
+            <w:left w:w="108" w:type="dxa"/>
+            <w:bottom w:w="0" w:type="dxa"/>
+            <w:right w:w="108" w:type="dxa"/>
+          </w:tblCellMar>
         </w:tblPrEx>
         <w:trPr>
           <w:tblHeader/>
@@ -691,6 +721,12 @@
             <w:insideH w:val="single" w:color="auto" w:sz="4" w:space="0"/>
             <w:insideV w:val="single" w:color="auto" w:sz="4" w:space="0"/>
           </w:tblBorders>
+          <w:tblCellMar>
+            <w:top w:w="0" w:type="dxa"/>
+            <w:left w:w="108" w:type="dxa"/>
+            <w:bottom w:w="0" w:type="dxa"/>
+            <w:right w:w="108" w:type="dxa"/>
+          </w:tblCellMar>
         </w:tblPrEx>
         <w:trPr>
           <w:jc w:val="center"/>
@@ -776,6 +812,12 @@
             <w:insideH w:val="single" w:color="auto" w:sz="4" w:space="0"/>
             <w:insideV w:val="single" w:color="auto" w:sz="4" w:space="0"/>
           </w:tblBorders>
+          <w:tblCellMar>
+            <w:top w:w="0" w:type="dxa"/>
+            <w:left w:w="108" w:type="dxa"/>
+            <w:bottom w:w="0" w:type="dxa"/>
+            <w:right w:w="108" w:type="dxa"/>
+          </w:tblCellMar>
         </w:tblPrEx>
         <w:trPr>
           <w:jc w:val="center"/>
@@ -861,6 +903,12 @@
             <w:insideH w:val="single" w:color="auto" w:sz="4" w:space="0"/>
             <w:insideV w:val="single" w:color="auto" w:sz="4" w:space="0"/>
           </w:tblBorders>
+          <w:tblCellMar>
+            <w:top w:w="0" w:type="dxa"/>
+            <w:left w:w="108" w:type="dxa"/>
+            <w:bottom w:w="0" w:type="dxa"/>
+            <w:right w:w="108" w:type="dxa"/>
+          </w:tblCellMar>
         </w:tblPrEx>
         <w:trPr>
           <w:jc w:val="center"/>
@@ -946,6 +994,12 @@
             <w:insideH w:val="single" w:color="auto" w:sz="4" w:space="0"/>
             <w:insideV w:val="single" w:color="auto" w:sz="4" w:space="0"/>
           </w:tblBorders>
+          <w:tblCellMar>
+            <w:top w:w="0" w:type="dxa"/>
+            <w:left w:w="108" w:type="dxa"/>
+            <w:bottom w:w="0" w:type="dxa"/>
+            <w:right w:w="108" w:type="dxa"/>
+          </w:tblCellMar>
         </w:tblPrEx>
         <w:trPr>
           <w:jc w:val="center"/>
@@ -1031,6 +1085,12 @@
             <w:insideH w:val="single" w:color="auto" w:sz="4" w:space="0"/>
             <w:insideV w:val="single" w:color="auto" w:sz="4" w:space="0"/>
           </w:tblBorders>
+          <w:tblCellMar>
+            <w:top w:w="0" w:type="dxa"/>
+            <w:left w:w="108" w:type="dxa"/>
+            <w:bottom w:w="0" w:type="dxa"/>
+            <w:right w:w="108" w:type="dxa"/>
+          </w:tblCellMar>
         </w:tblPrEx>
         <w:trPr>
           <w:jc w:val="center"/>
@@ -1116,6 +1176,12 @@
             <w:insideH w:val="single" w:color="auto" w:sz="4" w:space="0"/>
             <w:insideV w:val="single" w:color="auto" w:sz="4" w:space="0"/>
           </w:tblBorders>
+          <w:tblCellMar>
+            <w:top w:w="0" w:type="dxa"/>
+            <w:left w:w="108" w:type="dxa"/>
+            <w:bottom w:w="0" w:type="dxa"/>
+            <w:right w:w="108" w:type="dxa"/>
+          </w:tblCellMar>
         </w:tblPrEx>
         <w:trPr>
           <w:jc w:val="center"/>
@@ -1214,6 +1280,14 @@
         <w:gridCol w:w="9866"/>
       </w:tblGrid>
       <w:tr>
+        <w:tblPrEx>
+          <w:tblCellMar>
+            <w:top w:w="0" w:type="dxa"/>
+            <w:left w:w="108" w:type="dxa"/>
+            <w:bottom w:w="0" w:type="dxa"/>
+            <w:right w:w="108" w:type="dxa"/>
+          </w:tblCellMar>
+        </w:tblPrEx>
         <w:trPr>
           <w:jc w:val="center"/>
         </w:trPr>
@@ -1514,6 +1588,12 @@
             <w:insideH w:val="single" w:color="auto" w:sz="4" w:space="0"/>
             <w:insideV w:val="single" w:color="auto" w:sz="4" w:space="0"/>
           </w:tblBorders>
+          <w:tblCellMar>
+            <w:top w:w="0" w:type="dxa"/>
+            <w:left w:w="108" w:type="dxa"/>
+            <w:bottom w:w="0" w:type="dxa"/>
+            <w:right w:w="108" w:type="dxa"/>
+          </w:tblCellMar>
         </w:tblPrEx>
         <w:trPr>
           <w:tblHeader/>
@@ -1635,6 +1715,12 @@
             <w:insideH w:val="single" w:color="auto" w:sz="4" w:space="0"/>
             <w:insideV w:val="single" w:color="auto" w:sz="4" w:space="0"/>
           </w:tblBorders>
+          <w:tblCellMar>
+            <w:top w:w="0" w:type="dxa"/>
+            <w:left w:w="108" w:type="dxa"/>
+            <w:bottom w:w="0" w:type="dxa"/>
+            <w:right w:w="108" w:type="dxa"/>
+          </w:tblCellMar>
         </w:tblPrEx>
         <w:trPr>
           <w:jc w:val="center"/>
@@ -1755,6 +1841,12 @@
             <w:insideH w:val="single" w:color="auto" w:sz="4" w:space="0"/>
             <w:insideV w:val="single" w:color="auto" w:sz="4" w:space="0"/>
           </w:tblBorders>
+          <w:tblCellMar>
+            <w:top w:w="0" w:type="dxa"/>
+            <w:left w:w="108" w:type="dxa"/>
+            <w:bottom w:w="0" w:type="dxa"/>
+            <w:right w:w="108" w:type="dxa"/>
+          </w:tblCellMar>
         </w:tblPrEx>
         <w:trPr>
           <w:jc w:val="center"/>
@@ -1875,6 +1967,12 @@
             <w:insideH w:val="single" w:color="auto" w:sz="4" w:space="0"/>
             <w:insideV w:val="single" w:color="auto" w:sz="4" w:space="0"/>
           </w:tblBorders>
+          <w:tblCellMar>
+            <w:top w:w="0" w:type="dxa"/>
+            <w:left w:w="108" w:type="dxa"/>
+            <w:bottom w:w="0" w:type="dxa"/>
+            <w:right w:w="108" w:type="dxa"/>
+          </w:tblCellMar>
         </w:tblPrEx>
         <w:trPr>
           <w:jc w:val="center"/>
@@ -1995,6 +2093,12 @@
             <w:insideH w:val="single" w:color="auto" w:sz="4" w:space="0"/>
             <w:insideV w:val="single" w:color="auto" w:sz="4" w:space="0"/>
           </w:tblBorders>
+          <w:tblCellMar>
+            <w:top w:w="0" w:type="dxa"/>
+            <w:left w:w="108" w:type="dxa"/>
+            <w:bottom w:w="0" w:type="dxa"/>
+            <w:right w:w="108" w:type="dxa"/>
+          </w:tblCellMar>
         </w:tblPrEx>
         <w:trPr>
           <w:jc w:val="center"/>
@@ -2115,6 +2219,12 @@
             <w:insideH w:val="single" w:color="auto" w:sz="4" w:space="0"/>
             <w:insideV w:val="single" w:color="auto" w:sz="4" w:space="0"/>
           </w:tblBorders>
+          <w:tblCellMar>
+            <w:top w:w="0" w:type="dxa"/>
+            <w:left w:w="108" w:type="dxa"/>
+            <w:bottom w:w="0" w:type="dxa"/>
+            <w:right w:w="108" w:type="dxa"/>
+          </w:tblCellMar>
         </w:tblPrEx>
         <w:trPr>
           <w:jc w:val="center"/>
@@ -2235,6 +2345,12 @@
             <w:insideH w:val="single" w:color="auto" w:sz="4" w:space="0"/>
             <w:insideV w:val="single" w:color="auto" w:sz="4" w:space="0"/>
           </w:tblBorders>
+          <w:tblCellMar>
+            <w:top w:w="0" w:type="dxa"/>
+            <w:left w:w="108" w:type="dxa"/>
+            <w:bottom w:w="0" w:type="dxa"/>
+            <w:right w:w="108" w:type="dxa"/>
+          </w:tblCellMar>
         </w:tblPrEx>
         <w:trPr>
           <w:jc w:val="center"/>
@@ -2355,6 +2471,12 @@
             <w:insideH w:val="single" w:color="auto" w:sz="4" w:space="0"/>
             <w:insideV w:val="single" w:color="auto" w:sz="4" w:space="0"/>
           </w:tblBorders>
+          <w:tblCellMar>
+            <w:top w:w="0" w:type="dxa"/>
+            <w:left w:w="108" w:type="dxa"/>
+            <w:bottom w:w="0" w:type="dxa"/>
+            <w:right w:w="108" w:type="dxa"/>
+          </w:tblCellMar>
         </w:tblPrEx>
         <w:trPr>
           <w:jc w:val="center"/>
@@ -2488,6 +2610,14 @@
         <w:gridCol w:w="9866"/>
       </w:tblGrid>
       <w:tr>
+        <w:tblPrEx>
+          <w:tblCellMar>
+            <w:top w:w="0" w:type="dxa"/>
+            <w:left w:w="108" w:type="dxa"/>
+            <w:bottom w:w="0" w:type="dxa"/>
+            <w:right w:w="108" w:type="dxa"/>
+          </w:tblCellMar>
+        </w:tblPrEx>
         <w:trPr>
           <w:jc w:val="center"/>
         </w:trPr>
@@ -2706,6 +2836,14 @@
         <w:gridCol w:w="9866"/>
       </w:tblGrid>
       <w:tr>
+        <w:tblPrEx>
+          <w:tblCellMar>
+            <w:top w:w="0" w:type="dxa"/>
+            <w:left w:w="108" w:type="dxa"/>
+            <w:bottom w:w="0" w:type="dxa"/>
+            <w:right w:w="108" w:type="dxa"/>
+          </w:tblCellMar>
+        </w:tblPrEx>
         <w:trPr>
           <w:jc w:val="center"/>
         </w:trPr>
@@ -2834,6 +2972,12 @@
             <w:insideH w:val="single" w:color="auto" w:sz="4" w:space="0"/>
             <w:insideV w:val="single" w:color="auto" w:sz="4" w:space="0"/>
           </w:tblBorders>
+          <w:tblCellMar>
+            <w:top w:w="0" w:type="dxa"/>
+            <w:left w:w="108" w:type="dxa"/>
+            <w:bottom w:w="0" w:type="dxa"/>
+            <w:right w:w="108" w:type="dxa"/>
+          </w:tblCellMar>
         </w:tblPrEx>
         <w:trPr>
           <w:tblHeader/>
@@ -2990,6 +3134,12 @@
             <w:insideH w:val="single" w:color="auto" w:sz="4" w:space="0"/>
             <w:insideV w:val="single" w:color="auto" w:sz="4" w:space="0"/>
           </w:tblBorders>
+          <w:tblCellMar>
+            <w:top w:w="0" w:type="dxa"/>
+            <w:left w:w="108" w:type="dxa"/>
+            <w:bottom w:w="0" w:type="dxa"/>
+            <w:right w:w="108" w:type="dxa"/>
+          </w:tblCellMar>
         </w:tblPrEx>
         <w:trPr>
           <w:jc w:val="center"/>
@@ -3145,6 +3295,12 @@
             <w:insideH w:val="single" w:color="auto" w:sz="4" w:space="0"/>
             <w:insideV w:val="single" w:color="auto" w:sz="4" w:space="0"/>
           </w:tblBorders>
+          <w:tblCellMar>
+            <w:top w:w="0" w:type="dxa"/>
+            <w:left w:w="108" w:type="dxa"/>
+            <w:bottom w:w="0" w:type="dxa"/>
+            <w:right w:w="108" w:type="dxa"/>
+          </w:tblCellMar>
         </w:tblPrEx>
         <w:trPr>
           <w:jc w:val="center"/>
@@ -3455,6 +3611,12 @@
             <w:insideH w:val="single" w:color="auto" w:sz="4" w:space="0"/>
             <w:insideV w:val="single" w:color="auto" w:sz="4" w:space="0"/>
           </w:tblBorders>
+          <w:tblCellMar>
+            <w:top w:w="0" w:type="dxa"/>
+            <w:left w:w="108" w:type="dxa"/>
+            <w:bottom w:w="0" w:type="dxa"/>
+            <w:right w:w="108" w:type="dxa"/>
+          </w:tblCellMar>
         </w:tblPrEx>
         <w:trPr>
           <w:jc w:val="center"/>
@@ -3623,6 +3785,14 @@
         <w:gridCol w:w="9866"/>
       </w:tblGrid>
       <w:tr>
+        <w:tblPrEx>
+          <w:tblCellMar>
+            <w:top w:w="0" w:type="dxa"/>
+            <w:left w:w="108" w:type="dxa"/>
+            <w:bottom w:w="0" w:type="dxa"/>
+            <w:right w:w="108" w:type="dxa"/>
+          </w:tblCellMar>
+        </w:tblPrEx>
         <w:trPr>
           <w:jc w:val="center"/>
         </w:trPr>
@@ -3806,6 +3976,14 @@
         <w:gridCol w:w="9866"/>
       </w:tblGrid>
       <w:tr>
+        <w:tblPrEx>
+          <w:tblCellMar>
+            <w:top w:w="0" w:type="dxa"/>
+            <w:left w:w="108" w:type="dxa"/>
+            <w:bottom w:w="0" w:type="dxa"/>
+            <w:right w:w="108" w:type="dxa"/>
+          </w:tblCellMar>
+        </w:tblPrEx>
         <w:trPr>
           <w:jc w:val="center"/>
         </w:trPr>
@@ -3987,6 +4165,12 @@
             <w:insideH w:val="single" w:color="auto" w:sz="4" w:space="0"/>
             <w:insideV w:val="single" w:color="auto" w:sz="4" w:space="0"/>
           </w:tblBorders>
+          <w:tblCellMar>
+            <w:top w:w="0" w:type="dxa"/>
+            <w:left w:w="108" w:type="dxa"/>
+            <w:bottom w:w="0" w:type="dxa"/>
+            <w:right w:w="108" w:type="dxa"/>
+          </w:tblCellMar>
         </w:tblPrEx>
         <w:trPr>
           <w:tblHeader/>
@@ -4178,6 +4362,12 @@
             <w:insideH w:val="single" w:color="auto" w:sz="4" w:space="0"/>
             <w:insideV w:val="single" w:color="auto" w:sz="4" w:space="0"/>
           </w:tblBorders>
+          <w:tblCellMar>
+            <w:top w:w="0" w:type="dxa"/>
+            <w:left w:w="108" w:type="dxa"/>
+            <w:bottom w:w="0" w:type="dxa"/>
+            <w:right w:w="108" w:type="dxa"/>
+          </w:tblCellMar>
         </w:tblPrEx>
         <w:trPr>
           <w:jc w:val="center"/>
@@ -4328,6 +4518,12 @@
             <w:insideH w:val="single" w:color="auto" w:sz="4" w:space="0"/>
             <w:insideV w:val="single" w:color="auto" w:sz="4" w:space="0"/>
           </w:tblBorders>
+          <w:tblCellMar>
+            <w:top w:w="0" w:type="dxa"/>
+            <w:left w:w="108" w:type="dxa"/>
+            <w:bottom w:w="0" w:type="dxa"/>
+            <w:right w:w="108" w:type="dxa"/>
+          </w:tblCellMar>
         </w:tblPrEx>
         <w:trPr>
           <w:jc w:val="center"/>
@@ -4478,6 +4674,12 @@
             <w:insideH w:val="single" w:color="auto" w:sz="4" w:space="0"/>
             <w:insideV w:val="single" w:color="auto" w:sz="4" w:space="0"/>
           </w:tblBorders>
+          <w:tblCellMar>
+            <w:top w:w="0" w:type="dxa"/>
+            <w:left w:w="108" w:type="dxa"/>
+            <w:bottom w:w="0" w:type="dxa"/>
+            <w:right w:w="108" w:type="dxa"/>
+          </w:tblCellMar>
         </w:tblPrEx>
         <w:trPr>
           <w:jc w:val="center"/>
@@ -4628,6 +4830,12 @@
             <w:insideH w:val="single" w:color="auto" w:sz="4" w:space="0"/>
             <w:insideV w:val="single" w:color="auto" w:sz="4" w:space="0"/>
           </w:tblBorders>
+          <w:tblCellMar>
+            <w:top w:w="0" w:type="dxa"/>
+            <w:left w:w="108" w:type="dxa"/>
+            <w:bottom w:w="0" w:type="dxa"/>
+            <w:right w:w="108" w:type="dxa"/>
+          </w:tblCellMar>
         </w:tblPrEx>
         <w:trPr>
           <w:jc w:val="center"/>
@@ -4778,6 +4986,12 @@
             <w:insideH w:val="single" w:color="auto" w:sz="4" w:space="0"/>
             <w:insideV w:val="single" w:color="auto" w:sz="4" w:space="0"/>
           </w:tblBorders>
+          <w:tblCellMar>
+            <w:top w:w="0" w:type="dxa"/>
+            <w:left w:w="108" w:type="dxa"/>
+            <w:bottom w:w="0" w:type="dxa"/>
+            <w:right w:w="108" w:type="dxa"/>
+          </w:tblCellMar>
         </w:tblPrEx>
         <w:trPr>
           <w:jc w:val="center"/>
@@ -5071,6 +5285,12 @@
             <w:insideH w:val="single" w:color="auto" w:sz="4" w:space="0"/>
             <w:insideV w:val="single" w:color="auto" w:sz="4" w:space="0"/>
           </w:tblBorders>
+          <w:tblCellMar>
+            <w:top w:w="0" w:type="dxa"/>
+            <w:left w:w="108" w:type="dxa"/>
+            <w:bottom w:w="0" w:type="dxa"/>
+            <w:right w:w="108" w:type="dxa"/>
+          </w:tblCellMar>
         </w:tblPrEx>
         <w:trPr>
           <w:tblHeader/>
@@ -5192,6 +5412,12 @@
             <w:insideH w:val="single" w:color="auto" w:sz="4" w:space="0"/>
             <w:insideV w:val="single" w:color="auto" w:sz="4" w:space="0"/>
           </w:tblBorders>
+          <w:tblCellMar>
+            <w:top w:w="0" w:type="dxa"/>
+            <w:left w:w="108" w:type="dxa"/>
+            <w:bottom w:w="0" w:type="dxa"/>
+            <w:right w:w="108" w:type="dxa"/>
+          </w:tblCellMar>
         </w:tblPrEx>
         <w:trPr>
           <w:jc w:val="center"/>
@@ -5312,6 +5538,12 @@
             <w:insideH w:val="single" w:color="auto" w:sz="4" w:space="0"/>
             <w:insideV w:val="single" w:color="auto" w:sz="4" w:space="0"/>
           </w:tblBorders>
+          <w:tblCellMar>
+            <w:top w:w="0" w:type="dxa"/>
+            <w:left w:w="108" w:type="dxa"/>
+            <w:bottom w:w="0" w:type="dxa"/>
+            <w:right w:w="108" w:type="dxa"/>
+          </w:tblCellMar>
         </w:tblPrEx>
         <w:trPr>
           <w:jc w:val="center"/>
@@ -5432,6 +5664,12 @@
             <w:insideH w:val="single" w:color="auto" w:sz="4" w:space="0"/>
             <w:insideV w:val="single" w:color="auto" w:sz="4" w:space="0"/>
           </w:tblBorders>
+          <w:tblCellMar>
+            <w:top w:w="0" w:type="dxa"/>
+            <w:left w:w="108" w:type="dxa"/>
+            <w:bottom w:w="0" w:type="dxa"/>
+            <w:right w:w="108" w:type="dxa"/>
+          </w:tblCellMar>
         </w:tblPrEx>
         <w:trPr>
           <w:jc w:val="center"/>
@@ -5552,6 +5790,12 @@
             <w:insideH w:val="single" w:color="auto" w:sz="4" w:space="0"/>
             <w:insideV w:val="single" w:color="auto" w:sz="4" w:space="0"/>
           </w:tblBorders>
+          <w:tblCellMar>
+            <w:top w:w="0" w:type="dxa"/>
+            <w:left w:w="108" w:type="dxa"/>
+            <w:bottom w:w="0" w:type="dxa"/>
+            <w:right w:w="108" w:type="dxa"/>
+          </w:tblCellMar>
         </w:tblPrEx>
         <w:trPr>
           <w:jc w:val="center"/>
@@ -5710,6 +5954,12 @@
             <w:insideH w:val="single" w:color="auto" w:sz="4" w:space="0"/>
             <w:insideV w:val="single" w:color="auto" w:sz="4" w:space="0"/>
           </w:tblBorders>
+          <w:tblCellMar>
+            <w:top w:w="0" w:type="dxa"/>
+            <w:left w:w="108" w:type="dxa"/>
+            <w:bottom w:w="0" w:type="dxa"/>
+            <w:right w:w="108" w:type="dxa"/>
+          </w:tblCellMar>
         </w:tblPrEx>
         <w:trPr>
           <w:tblHeader/>
@@ -5866,6 +6116,12 @@
             <w:insideH w:val="single" w:color="auto" w:sz="4" w:space="0"/>
             <w:insideV w:val="single" w:color="auto" w:sz="4" w:space="0"/>
           </w:tblBorders>
+          <w:tblCellMar>
+            <w:top w:w="0" w:type="dxa"/>
+            <w:left w:w="108" w:type="dxa"/>
+            <w:bottom w:w="0" w:type="dxa"/>
+            <w:right w:w="108" w:type="dxa"/>
+          </w:tblCellMar>
         </w:tblPrEx>
         <w:trPr>
           <w:jc w:val="center"/>
@@ -5991,6 +6247,12 @@
             <w:insideH w:val="single" w:color="auto" w:sz="4" w:space="0"/>
             <w:insideV w:val="single" w:color="auto" w:sz="4" w:space="0"/>
           </w:tblBorders>
+          <w:tblCellMar>
+            <w:top w:w="0" w:type="dxa"/>
+            <w:left w:w="108" w:type="dxa"/>
+            <w:bottom w:w="0" w:type="dxa"/>
+            <w:right w:w="108" w:type="dxa"/>
+          </w:tblCellMar>
         </w:tblPrEx>
         <w:trPr>
           <w:jc w:val="center"/>
@@ -6241,6 +6503,12 @@
             <w:insideH w:val="single" w:color="auto" w:sz="4" w:space="0"/>
             <w:insideV w:val="single" w:color="auto" w:sz="4" w:space="0"/>
           </w:tblBorders>
+          <w:tblCellMar>
+            <w:top w:w="0" w:type="dxa"/>
+            <w:left w:w="108" w:type="dxa"/>
+            <w:bottom w:w="0" w:type="dxa"/>
+            <w:right w:w="108" w:type="dxa"/>
+          </w:tblCellMar>
         </w:tblPrEx>
         <w:trPr>
           <w:jc w:val="center"/>
@@ -6365,99 +6633,73 @@
     <w:p>
       <w:pPr>
         <w:pStyle w:val="165"/>
+        <w:rPr>
+          <w:rFonts w:hint="default"/>
+          <w:lang w:val="en-GB"/>
+        </w:rPr>
       </w:pPr>
       <w:r>
-        <w:t>8. What counts as support in the exam answer?</w:t>
+        <w:t>8. What counts as support</w:t>
+      </w:r>
+      <w:r>
+        <w:rPr>
+          <w:rFonts w:hint="default"/>
+          <w:lang w:val="en-GB"/>
+        </w:rPr>
+        <w:t>?</w:t>
       </w:r>
     </w:p>
     <w:p>
-      <w:pPr/>
       <w:r>
         <w:t>Use the regression output to decide whether each predictor shows a unique association with mean lexical decision RT once the other predictors are included in the model.</w:t>
       </w:r>
     </w:p>
     <w:p>
-      <w:pPr/>
-      <w:r>
-        <w:t>For the exam answer, do not just say whether a predictor was supported. Show the evidence.</w:t>
-      </w:r>
-    </w:p>
-    <w:p>
-      <w:pPr/>
       <w:r>
         <w:t>For each predictor, report:</w:t>
       </w:r>
     </w:p>
     <w:p>
-      <w:pPr/>
       <w:r>
         <w:t>• the coefficient (b)</w:t>
       </w:r>
     </w:p>
     <w:p>
-      <w:pPr/>
       <w:r>
         <w:t>• its standard error (SE)</w:t>
       </w:r>
     </w:p>
     <w:p>
-      <w:pPr/>
       <w:r>
         <w:t>• its p value</w:t>
       </w:r>
     </w:p>
     <w:p>
-      <w:pPr/>
       <w:r>
         <w:t>• the direction of the effect in plain language</w:t>
       </w:r>
     </w:p>
     <w:p>
-      <w:pPr/>
       <w:r>
         <w:t>Treat a predictor as supported only if the coefficient is in a meaningful direction and the regression output provides clear evidence for a unique effect once the other predictors are included.</w:t>
       </w:r>
     </w:p>
     <w:p>
-      <w:pPr/>
       <w:r>
         <w:t>Interpret the directions carefully:</w:t>
       </w:r>
     </w:p>
     <w:p>
-      <w:pPr/>
       <w:r>
-        <w:t>• A negative coefficient for log_frequency means more frequent words are recognised faster.</w:t>
+        <w:t xml:space="preserve">Your theoretical conclusion should say </w:t>
       </w:r>
-    </w:p>
-    <w:p>
-      <w:pPr/>
       <w:r>
-        <w:t>• A positive coefficient for AoA means later-learned words are recognised more slowly.</w:t>
+        <w:rPr>
+          <w:rFonts w:hint="default"/>
+          <w:lang w:val="en-GB"/>
+        </w:rPr>
+        <w:t>what the pattern appears to show.</w:t>
       </w:r>
-    </w:p>
-    <w:p>
-      <w:pPr/>
-      <w:r>
-        <w:t>• A positive coefficient for length means longer words are recognised more slowly.</w:t>
-      </w:r>
-    </w:p>
-    <w:p>
-      <w:pPr/>
-      <w:r>
-        <w:t>• OLD20 must be interpreted carefully because lower values mean denser orthographic neighbourhoods.</w:t>
-      </w:r>
-    </w:p>
-    <w:p>
-      <w:pPr/>
-      <w:r>
-        <w:t>Your theoretical conclusion should say whether the pattern supports a frequency-based account, an AoA-based account, or both, and that conclusion should be justified using the regression results rather than guesses.</w:t>
-      </w:r>
-    </w:p>
-    <w:p>
-      <w:pPr>
-        <w:pStyle w:val="164"/>
-      </w:pPr>
     </w:p>
     <w:p>
       <w:pPr>
@@ -6478,111 +6720,88 @@
       </w:r>
     </w:p>
     <w:p>
-      <w:pPr/>
       <w:r>
-        <w:t>Write your answer as a short results write-up rather than as a filled-in table.</w:t>
+        <w:t>Your answer should include:</w:t>
       </w:r>
     </w:p>
     <w:p>
-      <w:pPr/>
-      <w:r>
-        <w:t>Make sure your final answer includes all four assessed parts:</w:t>
-      </w:r>
-    </w:p>
-    <w:p>
-      <w:pPr/>
       <w:r>
         <w:t>• Summary statistics: M and SD for mean_RT_ms, length, log_frequency, AoA, and OLD20.</w:t>
       </w:r>
     </w:p>
     <w:p>
-      <w:pPr/>
       <w:r>
         <w:t>• Correlation: Pearson's r for log_frequency with AoA.</w:t>
       </w:r>
     </w:p>
     <w:p>
-      <w:pPr/>
       <w:r>
         <w:t>• Figure: a clearly labelled scatterplot showing the relation between mean_RT_ms and log_frequency, with a caption.</w:t>
       </w:r>
     </w:p>
     <w:p>
-      <w:pPr/>
       <w:r>
         <w:t>• Statistical test: the full multiple regression with length, log_frequency, AoA, and OLD20 entered together, plus R² (or adjusted R²) and b, SE, and p for each predictor.</w:t>
       </w:r>
     </w:p>
     <w:p>
-      <w:pPr/>
       <w:r>
-        <w:t>Your interpretation should then do three things:</w:t>
+        <w:t>Your interpretation should:</w:t>
       </w:r>
     </w:p>
     <w:p>
-      <w:pPr/>
       <w:r>
-        <w:t>• explain the theoretical conclusion using the unique effects in the regression model</w:t>
+        <w:t>• explain the theoretical conclusion using the regression results</w:t>
       </w:r>
     </w:p>
     <w:p>
-      <w:pPr/>
       <w:r>
         <w:t>• give a plain-language summary of why some words are recognised faster than others</w:t>
       </w:r>
     </w:p>
     <w:p>
-      <w:pPr/>
       <w:r>
         <w:t>• state what lexical decision RT is generally taken to reflect, while noting that decision and response components may also contribute</w:t>
       </w:r>
     </w:p>
     <w:p>
-      <w:pPr/>
       <w:r>
-        <w:t>Sentence frame:</w:t>
+        <w:t>Sentence frame (optional):</w:t>
       </w:r>
     </w:p>
     <w:p>
-      <w:pPr/>
       <w:r>
-        <w:t>• Descriptive statistics showed that [summarise the pattern briefly].</w:t>
+        <w:t>• Descriptive statistics showed that ...</w:t>
       </w:r>
     </w:p>
     <w:p>
-      <w:pPr/>
       <w:r>
-        <w:t>• The correlation between log_frequency and AoA was r = [value].</w:t>
+        <w:t>• The correlation between log_frequency and AoA was ...</w:t>
       </w:r>
     </w:p>
     <w:p>
-      <w:pPr/>
       <w:r>
-        <w:t>• A multiple regression tested whether length, log_frequency, AoA, and OLD20 predicted mean lexical decision RT.</w:t>
+        <w:t>• A multiple regression tested whether ...</w:t>
       </w:r>
     </w:p>
     <w:p>
-      <w:pPr/>
       <w:r>
-        <w:t>• The model explained [R² or adjusted R²] of the variance in mean lexical decision RT.</w:t>
+        <w:t>• The model explained ...</w:t>
       </w:r>
     </w:p>
     <w:p>
-      <w:pPr/>
       <w:r>
-        <w:t>• [Predictor] showed a unique effect (b = [ ], SE = [ ], p = [ ]), indicating that [plain-language interpretation].</w:t>
+        <w:t>• [Predictor] showed / did not show a unique effect ...</w:t>
       </w:r>
     </w:p>
     <w:p>
-      <w:pPr/>
       <w:r>
-        <w:t>• Overall, the pattern suggests that [frequency-based, AoA-based, or both], because [brief justification from the regression results].</w:t>
+        <w:t>• Overall, the pattern suggests ...</w:t>
       </w:r>
     </w:p>
     <w:p>
-      <w:pPr/>
       <w:r>
-        <w:t>• More generally, lexical decision RT is usually taken to reflect lexical access, although decision and response processes may also contribute.</w:t>
+        <w:t>• More generally, lexical decision RT is usually taken to reflect ...</w:t>
       </w:r>
     </w:p>
     <w:p>
@@ -7076,7 +7295,7 @@
     <w:lsdException w:uiPriority="99" w:name="Normal Indent"/>
     <w:lsdException w:uiPriority="99" w:name="footnote text"/>
     <w:lsdException w:uiPriority="99" w:name="annotation text"/>
-    <w:lsdException w:uiPriority="99" w:semiHidden="0" w:name="header"/>
+    <w:lsdException w:qFormat="1" w:uiPriority="99" w:semiHidden="0" w:name="header"/>
     <w:lsdException w:qFormat="1" w:uiPriority="99" w:semiHidden="0" w:name="footer"/>
     <w:lsdException w:uiPriority="99" w:name="index heading"/>
     <w:lsdException w:qFormat="1" w:uiPriority="35" w:name="caption"/>
@@ -7090,21 +7309,21 @@
     <w:lsdException w:uiPriority="99" w:name="endnote reference"/>
     <w:lsdException w:uiPriority="99" w:name="endnote text"/>
     <w:lsdException w:uiPriority="99" w:name="table of authorities"/>
-    <w:lsdException w:uiPriority="99" w:semiHidden="0" w:name="macro"/>
+    <w:lsdException w:qFormat="1" w:uiPriority="99" w:semiHidden="0" w:name="macro"/>
     <w:lsdException w:uiPriority="99" w:name="toa heading"/>
-    <w:lsdException w:uiPriority="99" w:semiHidden="0" w:name="List"/>
-    <w:lsdException w:uiPriority="99" w:semiHidden="0" w:name="List Bullet"/>
-    <w:lsdException w:uiPriority="99" w:semiHidden="0" w:name="List Number"/>
-    <w:lsdException w:uiPriority="99" w:semiHidden="0" w:name="List 2"/>
-    <w:lsdException w:uiPriority="99" w:semiHidden="0" w:name="List 3"/>
+    <w:lsdException w:qFormat="1" w:uiPriority="99" w:semiHidden="0" w:name="List"/>
+    <w:lsdException w:qFormat="1" w:uiPriority="99" w:semiHidden="0" w:name="List Bullet"/>
+    <w:lsdException w:qFormat="1" w:uiPriority="99" w:semiHidden="0" w:name="List Number"/>
+    <w:lsdException w:qFormat="1" w:uiPriority="99" w:semiHidden="0" w:name="List 2"/>
+    <w:lsdException w:qFormat="1" w:uiPriority="99" w:semiHidden="0" w:name="List 3"/>
     <w:lsdException w:uiPriority="99" w:name="List 4"/>
     <w:lsdException w:uiPriority="99" w:name="List 5"/>
-    <w:lsdException w:uiPriority="99" w:semiHidden="0" w:name="List Bullet 2"/>
-    <w:lsdException w:uiPriority="99" w:semiHidden="0" w:name="List Bullet 3"/>
+    <w:lsdException w:qFormat="1" w:uiPriority="99" w:semiHidden="0" w:name="List Bullet 2"/>
+    <w:lsdException w:qFormat="1" w:uiPriority="99" w:semiHidden="0" w:name="List Bullet 3"/>
     <w:lsdException w:uiPriority="99" w:name="List Bullet 4"/>
     <w:lsdException w:uiPriority="99" w:name="List Bullet 5"/>
-    <w:lsdException w:uiPriority="99" w:semiHidden="0" w:name="List Number 2"/>
-    <w:lsdException w:uiPriority="99" w:semiHidden="0" w:name="List Number 3"/>
+    <w:lsdException w:qFormat="1" w:uiPriority="99" w:semiHidden="0" w:name="List Number 2"/>
+    <w:lsdException w:qFormat="1" w:uiPriority="99" w:semiHidden="0" w:name="List Number 3"/>
     <w:lsdException w:uiPriority="99" w:name="List Number 4"/>
     <w:lsdException w:uiPriority="99" w:name="List Number 5"/>
     <w:lsdException w:qFormat="1" w:unhideWhenUsed="0" w:uiPriority="10" w:semiHidden="0" w:name="Title"/>
@@ -7113,9 +7332,9 @@
     <w:lsdException w:qFormat="1" w:uiPriority="1" w:name="Default Paragraph Font"/>
     <w:lsdException w:qFormat="1" w:uiPriority="99" w:semiHidden="0" w:name="Body Text"/>
     <w:lsdException w:uiPriority="99" w:name="Body Text Indent"/>
-    <w:lsdException w:uiPriority="99" w:semiHidden="0" w:name="List Continue"/>
-    <w:lsdException w:uiPriority="99" w:semiHidden="0" w:name="List Continue 2"/>
-    <w:lsdException w:uiPriority="99" w:semiHidden="0" w:name="List Continue 3"/>
+    <w:lsdException w:qFormat="1" w:uiPriority="99" w:semiHidden="0" w:name="List Continue"/>
+    <w:lsdException w:qFormat="1" w:uiPriority="99" w:semiHidden="0" w:name="List Continue 2"/>
+    <w:lsdException w:qFormat="1" w:uiPriority="99" w:semiHidden="0" w:name="List Continue 3"/>
     <w:lsdException w:uiPriority="99" w:name="List Continue 4"/>
     <w:lsdException w:uiPriority="99" w:name="List Continue 5"/>
     <w:lsdException w:uiPriority="99" w:name="Message Header"/>
@@ -7125,8 +7344,8 @@
     <w:lsdException w:uiPriority="99" w:name="Body Text First Indent"/>
     <w:lsdException w:uiPriority="99" w:name="Body Text First Indent 2"/>
     <w:lsdException w:uiPriority="99" w:name="Note Heading"/>
-    <w:lsdException w:uiPriority="99" w:semiHidden="0" w:name="Body Text 2"/>
-    <w:lsdException w:uiPriority="99" w:semiHidden="0" w:name="Body Text 3"/>
+    <w:lsdException w:qFormat="1" w:uiPriority="99" w:semiHidden="0" w:name="Body Text 2"/>
+    <w:lsdException w:qFormat="1" w:uiPriority="99" w:semiHidden="0" w:name="Body Text 3"/>
     <w:lsdException w:uiPriority="99" w:name="Body Text Indent 2"/>
     <w:lsdException w:uiPriority="99" w:name="Body Text Indent 3"/>
     <w:lsdException w:uiPriority="99" w:name="Block Text"/>
@@ -7193,110 +7412,110 @@
     <w:lsdException w:uiPriority="99" w:name="Table Web 2"/>
     <w:lsdException w:uiPriority="99" w:name="Table Web 3"/>
     <w:lsdException w:uiPriority="99" w:name="Balloon Text"/>
-    <w:lsdException w:unhideWhenUsed="0" w:uiPriority="59" w:semiHidden="0" w:name="Table Grid"/>
+    <w:lsdException w:qFormat="1" w:unhideWhenUsed="0" w:uiPriority="59" w:semiHidden="0" w:name="Table Grid"/>
     <w:lsdException w:uiPriority="99" w:name="Table Theme"/>
     <w:lsdException w:qFormat="1" w:unhideWhenUsed="0" w:uiPriority="1" w:semiHidden="0" w:name="No Spacing"/>
-    <w:lsdException w:unhideWhenUsed="0" w:uiPriority="60" w:semiHidden="0" w:name="Light Shading"/>
-    <w:lsdException w:unhideWhenUsed="0" w:uiPriority="61" w:semiHidden="0" w:name="Light List"/>
-    <w:lsdException w:unhideWhenUsed="0" w:uiPriority="62" w:semiHidden="0" w:name="Light Grid"/>
-    <w:lsdException w:unhideWhenUsed="0" w:uiPriority="63" w:semiHidden="0" w:name="Medium Shading 1"/>
-    <w:lsdException w:unhideWhenUsed="0" w:uiPriority="64" w:semiHidden="0" w:name="Medium Shading 2"/>
-    <w:lsdException w:unhideWhenUsed="0" w:uiPriority="65" w:semiHidden="0" w:name="Medium List 1"/>
-    <w:lsdException w:unhideWhenUsed="0" w:uiPriority="66" w:semiHidden="0" w:name="Medium List 2"/>
-    <w:lsdException w:unhideWhenUsed="0" w:uiPriority="67" w:semiHidden="0" w:name="Medium Grid 1"/>
-    <w:lsdException w:unhideWhenUsed="0" w:uiPriority="68" w:semiHidden="0" w:name="Medium Grid 2"/>
-    <w:lsdException w:unhideWhenUsed="0" w:uiPriority="69" w:semiHidden="0" w:name="Medium Grid 3"/>
-    <w:lsdException w:unhideWhenUsed="0" w:uiPriority="70" w:semiHidden="0" w:name="Dark List"/>
-    <w:lsdException w:unhideWhenUsed="0" w:uiPriority="71" w:semiHidden="0" w:name="Colorful Shading"/>
-    <w:lsdException w:unhideWhenUsed="0" w:uiPriority="72" w:semiHidden="0" w:name="Colorful List"/>
-    <w:lsdException w:unhideWhenUsed="0" w:uiPriority="73" w:semiHidden="0" w:name="Colorful Grid"/>
-    <w:lsdException w:unhideWhenUsed="0" w:uiPriority="60" w:semiHidden="0" w:name="Light Shading Accent 1"/>
-    <w:lsdException w:unhideWhenUsed="0" w:uiPriority="61" w:semiHidden="0" w:name="Light List Accent 1"/>
-    <w:lsdException w:unhideWhenUsed="0" w:uiPriority="62" w:semiHidden="0" w:name="Light Grid Accent 1"/>
-    <w:lsdException w:unhideWhenUsed="0" w:uiPriority="63" w:semiHidden="0" w:name="Medium Shading 1 Accent 1"/>
-    <w:lsdException w:unhideWhenUsed="0" w:uiPriority="64" w:semiHidden="0" w:name="Medium Shading 2 Accent 1"/>
-    <w:lsdException w:unhideWhenUsed="0" w:uiPriority="65" w:semiHidden="0" w:name="Medium List 1 Accent 1"/>
+    <w:lsdException w:qFormat="1" w:unhideWhenUsed="0" w:uiPriority="60" w:semiHidden="0" w:name="Light Shading"/>
+    <w:lsdException w:qFormat="1" w:unhideWhenUsed="0" w:uiPriority="61" w:semiHidden="0" w:name="Light List"/>
+    <w:lsdException w:qFormat="1" w:unhideWhenUsed="0" w:uiPriority="62" w:semiHidden="0" w:name="Light Grid"/>
+    <w:lsdException w:qFormat="1" w:unhideWhenUsed="0" w:uiPriority="63" w:semiHidden="0" w:name="Medium Shading 1"/>
+    <w:lsdException w:qFormat="1" w:unhideWhenUsed="0" w:uiPriority="64" w:semiHidden="0" w:name="Medium Shading 2"/>
+    <w:lsdException w:qFormat="1" w:unhideWhenUsed="0" w:uiPriority="65" w:semiHidden="0" w:name="Medium List 1"/>
+    <w:lsdException w:qFormat="1" w:unhideWhenUsed="0" w:uiPriority="66" w:semiHidden="0" w:name="Medium List 2"/>
+    <w:lsdException w:qFormat="1" w:unhideWhenUsed="0" w:uiPriority="67" w:semiHidden="0" w:name="Medium Grid 1"/>
+    <w:lsdException w:qFormat="1" w:unhideWhenUsed="0" w:uiPriority="68" w:semiHidden="0" w:name="Medium Grid 2"/>
+    <w:lsdException w:qFormat="1" w:unhideWhenUsed="0" w:uiPriority="69" w:semiHidden="0" w:name="Medium Grid 3"/>
+    <w:lsdException w:qFormat="1" w:unhideWhenUsed="0" w:uiPriority="70" w:semiHidden="0" w:name="Dark List"/>
+    <w:lsdException w:qFormat="1" w:unhideWhenUsed="0" w:uiPriority="71" w:semiHidden="0" w:name="Colorful Shading"/>
+    <w:lsdException w:qFormat="1" w:unhideWhenUsed="0" w:uiPriority="72" w:semiHidden="0" w:name="Colorful List"/>
+    <w:lsdException w:qFormat="1" w:unhideWhenUsed="0" w:uiPriority="73" w:semiHidden="0" w:name="Colorful Grid"/>
+    <w:lsdException w:qFormat="1" w:unhideWhenUsed="0" w:uiPriority="60" w:semiHidden="0" w:name="Light Shading Accent 1"/>
+    <w:lsdException w:qFormat="1" w:unhideWhenUsed="0" w:uiPriority="61" w:semiHidden="0" w:name="Light List Accent 1"/>
+    <w:lsdException w:qFormat="1" w:unhideWhenUsed="0" w:uiPriority="62" w:semiHidden="0" w:name="Light Grid Accent 1"/>
+    <w:lsdException w:qFormat="1" w:unhideWhenUsed="0" w:uiPriority="63" w:semiHidden="0" w:name="Medium Shading 1 Accent 1"/>
+    <w:lsdException w:qFormat="1" w:unhideWhenUsed="0" w:uiPriority="64" w:semiHidden="0" w:name="Medium Shading 2 Accent 1"/>
+    <w:lsdException w:qFormat="1" w:unhideWhenUsed="0" w:uiPriority="65" w:semiHidden="0" w:name="Medium List 1 Accent 1"/>
     <w:lsdException w:qFormat="1" w:unhideWhenUsed="0" w:uiPriority="34" w:semiHidden="0" w:name="List Paragraph"/>
     <w:lsdException w:qFormat="1" w:unhideWhenUsed="0" w:uiPriority="29" w:semiHidden="0" w:name="Quote"/>
     <w:lsdException w:qFormat="1" w:unhideWhenUsed="0" w:uiPriority="30" w:semiHidden="0" w:name="Intense Quote"/>
-    <w:lsdException w:unhideWhenUsed="0" w:uiPriority="66" w:semiHidden="0" w:name="Medium List 2 Accent 1"/>
-    <w:lsdException w:unhideWhenUsed="0" w:uiPriority="67" w:semiHidden="0" w:name="Medium Grid 1 Accent 1"/>
-    <w:lsdException w:unhideWhenUsed="0" w:uiPriority="68" w:semiHidden="0" w:name="Medium Grid 2 Accent 1"/>
-    <w:lsdException w:unhideWhenUsed="0" w:uiPriority="69" w:semiHidden="0" w:name="Medium Grid 3 Accent 1"/>
-    <w:lsdException w:unhideWhenUsed="0" w:uiPriority="70" w:semiHidden="0" w:name="Dark List Accent 1"/>
-    <w:lsdException w:unhideWhenUsed="0" w:uiPriority="71" w:semiHidden="0" w:name="Colorful Shading Accent 1"/>
-    <w:lsdException w:unhideWhenUsed="0" w:uiPriority="72" w:semiHidden="0" w:name="Colorful List Accent 1"/>
-    <w:lsdException w:unhideWhenUsed="0" w:uiPriority="73" w:semiHidden="0" w:name="Colorful Grid Accent 1"/>
-    <w:lsdException w:unhideWhenUsed="0" w:uiPriority="60" w:semiHidden="0" w:name="Light Shading Accent 2"/>
-    <w:lsdException w:unhideWhenUsed="0" w:uiPriority="61" w:semiHidden="0" w:name="Light List Accent 2"/>
-    <w:lsdException w:unhideWhenUsed="0" w:uiPriority="62" w:semiHidden="0" w:name="Light Grid Accent 2"/>
-    <w:lsdException w:unhideWhenUsed="0" w:uiPriority="63" w:semiHidden="0" w:name="Medium Shading 1 Accent 2"/>
-    <w:lsdException w:unhideWhenUsed="0" w:uiPriority="64" w:semiHidden="0" w:name="Medium Shading 2 Accent 2"/>
-    <w:lsdException w:unhideWhenUsed="0" w:uiPriority="65" w:semiHidden="0" w:name="Medium List 1 Accent 2"/>
-    <w:lsdException w:unhideWhenUsed="0" w:uiPriority="66" w:semiHidden="0" w:name="Medium List 2 Accent 2"/>
-    <w:lsdException w:unhideWhenUsed="0" w:uiPriority="67" w:semiHidden="0" w:name="Medium Grid 1 Accent 2"/>
-    <w:lsdException w:unhideWhenUsed="0" w:uiPriority="68" w:semiHidden="0" w:name="Medium Grid 2 Accent 2"/>
-    <w:lsdException w:unhideWhenUsed="0" w:uiPriority="69" w:semiHidden="0" w:name="Medium Grid 3 Accent 2"/>
-    <w:lsdException w:unhideWhenUsed="0" w:uiPriority="70" w:semiHidden="0" w:name="Dark List Accent 2"/>
-    <w:lsdException w:unhideWhenUsed="0" w:uiPriority="71" w:semiHidden="0" w:name="Colorful Shading Accent 2"/>
-    <w:lsdException w:unhideWhenUsed="0" w:uiPriority="72" w:semiHidden="0" w:name="Colorful List Accent 2"/>
-    <w:lsdException w:unhideWhenUsed="0" w:uiPriority="73" w:semiHidden="0" w:name="Colorful Grid Accent 2"/>
-    <w:lsdException w:unhideWhenUsed="0" w:uiPriority="60" w:semiHidden="0" w:name="Light Shading Accent 3"/>
-    <w:lsdException w:unhideWhenUsed="0" w:uiPriority="61" w:semiHidden="0" w:name="Light List Accent 3"/>
+    <w:lsdException w:qFormat="1" w:unhideWhenUsed="0" w:uiPriority="66" w:semiHidden="0" w:name="Medium List 2 Accent 1"/>
+    <w:lsdException w:qFormat="1" w:unhideWhenUsed="0" w:uiPriority="67" w:semiHidden="0" w:name="Medium Grid 1 Accent 1"/>
+    <w:lsdException w:qFormat="1" w:unhideWhenUsed="0" w:uiPriority="68" w:semiHidden="0" w:name="Medium Grid 2 Accent 1"/>
+    <w:lsdException w:qFormat="1" w:unhideWhenUsed="0" w:uiPriority="69" w:semiHidden="0" w:name="Medium Grid 3 Accent 1"/>
+    <w:lsdException w:qFormat="1" w:unhideWhenUsed="0" w:uiPriority="70" w:semiHidden="0" w:name="Dark List Accent 1"/>
+    <w:lsdException w:qFormat="1" w:unhideWhenUsed="0" w:uiPriority="71" w:semiHidden="0" w:name="Colorful Shading Accent 1"/>
+    <w:lsdException w:qFormat="1" w:unhideWhenUsed="0" w:uiPriority="72" w:semiHidden="0" w:name="Colorful List Accent 1"/>
+    <w:lsdException w:qFormat="1" w:unhideWhenUsed="0" w:uiPriority="73" w:semiHidden="0" w:name="Colorful Grid Accent 1"/>
+    <w:lsdException w:qFormat="1" w:unhideWhenUsed="0" w:uiPriority="60" w:semiHidden="0" w:name="Light Shading Accent 2"/>
+    <w:lsdException w:qFormat="1" w:unhideWhenUsed="0" w:uiPriority="61" w:semiHidden="0" w:name="Light List Accent 2"/>
+    <w:lsdException w:qFormat="1" w:unhideWhenUsed="0" w:uiPriority="62" w:semiHidden="0" w:name="Light Grid Accent 2"/>
+    <w:lsdException w:qFormat="1" w:unhideWhenUsed="0" w:uiPriority="63" w:semiHidden="0" w:name="Medium Shading 1 Accent 2"/>
+    <w:lsdException w:qFormat="1" w:unhideWhenUsed="0" w:uiPriority="64" w:semiHidden="0" w:name="Medium Shading 2 Accent 2"/>
+    <w:lsdException w:qFormat="1" w:unhideWhenUsed="0" w:uiPriority="65" w:semiHidden="0" w:name="Medium List 1 Accent 2"/>
+    <w:lsdException w:qFormat="1" w:unhideWhenUsed="0" w:uiPriority="66" w:semiHidden="0" w:name="Medium List 2 Accent 2"/>
+    <w:lsdException w:qFormat="1" w:unhideWhenUsed="0" w:uiPriority="67" w:semiHidden="0" w:name="Medium Grid 1 Accent 2"/>
+    <w:lsdException w:qFormat="1" w:unhideWhenUsed="0" w:uiPriority="68" w:semiHidden="0" w:name="Medium Grid 2 Accent 2"/>
+    <w:lsdException w:qFormat="1" w:unhideWhenUsed="0" w:uiPriority="69" w:semiHidden="0" w:name="Medium Grid 3 Accent 2"/>
+    <w:lsdException w:qFormat="1" w:unhideWhenUsed="0" w:uiPriority="70" w:semiHidden="0" w:name="Dark List Accent 2"/>
+    <w:lsdException w:qFormat="1" w:unhideWhenUsed="0" w:uiPriority="71" w:semiHidden="0" w:name="Colorful Shading Accent 2"/>
+    <w:lsdException w:qFormat="1" w:unhideWhenUsed="0" w:uiPriority="72" w:semiHidden="0" w:name="Colorful List Accent 2"/>
+    <w:lsdException w:qFormat="1" w:unhideWhenUsed="0" w:uiPriority="73" w:semiHidden="0" w:name="Colorful Grid Accent 2"/>
+    <w:lsdException w:qFormat="1" w:unhideWhenUsed="0" w:uiPriority="60" w:semiHidden="0" w:name="Light Shading Accent 3"/>
+    <w:lsdException w:qFormat="1" w:unhideWhenUsed="0" w:uiPriority="61" w:semiHidden="0" w:name="Light List Accent 3"/>
     <w:lsdException w:qFormat="1" w:unhideWhenUsed="0" w:uiPriority="62" w:semiHidden="0" w:name="Light Grid Accent 3"/>
-    <w:lsdException w:unhideWhenUsed="0" w:uiPriority="63" w:semiHidden="0" w:name="Medium Shading 1 Accent 3"/>
-    <w:lsdException w:unhideWhenUsed="0" w:uiPriority="64" w:semiHidden="0" w:name="Medium Shading 2 Accent 3"/>
-    <w:lsdException w:unhideWhenUsed="0" w:uiPriority="65" w:semiHidden="0" w:name="Medium List 1 Accent 3"/>
-    <w:lsdException w:unhideWhenUsed="0" w:uiPriority="66" w:semiHidden="0" w:name="Medium List 2 Accent 3"/>
-    <w:lsdException w:unhideWhenUsed="0" w:uiPriority="67" w:semiHidden="0" w:name="Medium Grid 1 Accent 3"/>
-    <w:lsdException w:unhideWhenUsed="0" w:uiPriority="68" w:semiHidden="0" w:name="Medium Grid 2 Accent 3"/>
-    <w:lsdException w:unhideWhenUsed="0" w:uiPriority="69" w:semiHidden="0" w:name="Medium Grid 3 Accent 3"/>
-    <w:lsdException w:unhideWhenUsed="0" w:uiPriority="70" w:semiHidden="0" w:name="Dark List Accent 3"/>
-    <w:lsdException w:unhideWhenUsed="0" w:uiPriority="71" w:semiHidden="0" w:name="Colorful Shading Accent 3"/>
-    <w:lsdException w:unhideWhenUsed="0" w:uiPriority="72" w:semiHidden="0" w:name="Colorful List Accent 3"/>
-    <w:lsdException w:unhideWhenUsed="0" w:uiPriority="73" w:semiHidden="0" w:name="Colorful Grid Accent 3"/>
-    <w:lsdException w:unhideWhenUsed="0" w:uiPriority="60" w:semiHidden="0" w:name="Light Shading Accent 4"/>
-    <w:lsdException w:unhideWhenUsed="0" w:uiPriority="61" w:semiHidden="0" w:name="Light List Accent 4"/>
-    <w:lsdException w:unhideWhenUsed="0" w:uiPriority="62" w:semiHidden="0" w:name="Light Grid Accent 4"/>
-    <w:lsdException w:unhideWhenUsed="0" w:uiPriority="63" w:semiHidden="0" w:name="Medium Shading 1 Accent 4"/>
-    <w:lsdException w:unhideWhenUsed="0" w:uiPriority="64" w:semiHidden="0" w:name="Medium Shading 2 Accent 4"/>
-    <w:lsdException w:unhideWhenUsed="0" w:uiPriority="65" w:semiHidden="0" w:name="Medium List 1 Accent 4"/>
-    <w:lsdException w:unhideWhenUsed="0" w:uiPriority="66" w:semiHidden="0" w:name="Medium List 2 Accent 4"/>
-    <w:lsdException w:unhideWhenUsed="0" w:uiPriority="67" w:semiHidden="0" w:name="Medium Grid 1 Accent 4"/>
-    <w:lsdException w:unhideWhenUsed="0" w:uiPriority="68" w:semiHidden="0" w:name="Medium Grid 2 Accent 4"/>
-    <w:lsdException w:unhideWhenUsed="0" w:uiPriority="69" w:semiHidden="0" w:name="Medium Grid 3 Accent 4"/>
-    <w:lsdException w:unhideWhenUsed="0" w:uiPriority="70" w:semiHidden="0" w:name="Dark List Accent 4"/>
-    <w:lsdException w:unhideWhenUsed="0" w:uiPriority="71" w:semiHidden="0" w:name="Colorful Shading Accent 4"/>
-    <w:lsdException w:unhideWhenUsed="0" w:uiPriority="72" w:semiHidden="0" w:name="Colorful List Accent 4"/>
-    <w:lsdException w:unhideWhenUsed="0" w:uiPriority="73" w:semiHidden="0" w:name="Colorful Grid Accent 4"/>
-    <w:lsdException w:unhideWhenUsed="0" w:uiPriority="60" w:semiHidden="0" w:name="Light Shading Accent 5"/>
-    <w:lsdException w:unhideWhenUsed="0" w:uiPriority="61" w:semiHidden="0" w:name="Light List Accent 5"/>
-    <w:lsdException w:unhideWhenUsed="0" w:uiPriority="62" w:semiHidden="0" w:name="Light Grid Accent 5"/>
-    <w:lsdException w:unhideWhenUsed="0" w:uiPriority="63" w:semiHidden="0" w:name="Medium Shading 1 Accent 5"/>
-    <w:lsdException w:unhideWhenUsed="0" w:uiPriority="64" w:semiHidden="0" w:name="Medium Shading 2 Accent 5"/>
-    <w:lsdException w:unhideWhenUsed="0" w:uiPriority="65" w:semiHidden="0" w:name="Medium List 1 Accent 5"/>
-    <w:lsdException w:unhideWhenUsed="0" w:uiPriority="66" w:semiHidden="0" w:name="Medium List 2 Accent 5"/>
-    <w:lsdException w:unhideWhenUsed="0" w:uiPriority="67" w:semiHidden="0" w:name="Medium Grid 1 Accent 5"/>
-    <w:lsdException w:unhideWhenUsed="0" w:uiPriority="68" w:semiHidden="0" w:name="Medium Grid 2 Accent 5"/>
-    <w:lsdException w:unhideWhenUsed="0" w:uiPriority="69" w:semiHidden="0" w:name="Medium Grid 3 Accent 5"/>
-    <w:lsdException w:unhideWhenUsed="0" w:uiPriority="70" w:semiHidden="0" w:name="Dark List Accent 5"/>
-    <w:lsdException w:unhideWhenUsed="0" w:uiPriority="71" w:semiHidden="0" w:name="Colorful Shading Accent 5"/>
-    <w:lsdException w:unhideWhenUsed="0" w:uiPriority="72" w:semiHidden="0" w:name="Colorful List Accent 5"/>
-    <w:lsdException w:unhideWhenUsed="0" w:uiPriority="73" w:semiHidden="0" w:name="Colorful Grid Accent 5"/>
-    <w:lsdException w:unhideWhenUsed="0" w:uiPriority="60" w:semiHidden="0" w:name="Light Shading Accent 6"/>
-    <w:lsdException w:unhideWhenUsed="0" w:uiPriority="61" w:semiHidden="0" w:name="Light List Accent 6"/>
-    <w:lsdException w:unhideWhenUsed="0" w:uiPriority="62" w:semiHidden="0" w:name="Light Grid Accent 6"/>
-    <w:lsdException w:unhideWhenUsed="0" w:uiPriority="63" w:semiHidden="0" w:name="Medium Shading 1 Accent 6"/>
-    <w:lsdException w:unhideWhenUsed="0" w:uiPriority="64" w:semiHidden="0" w:name="Medium Shading 2 Accent 6"/>
-    <w:lsdException w:unhideWhenUsed="0" w:uiPriority="65" w:semiHidden="0" w:name="Medium List 1 Accent 6"/>
-    <w:lsdException w:unhideWhenUsed="0" w:uiPriority="66" w:semiHidden="0" w:name="Medium List 2 Accent 6"/>
-    <w:lsdException w:unhideWhenUsed="0" w:uiPriority="67" w:semiHidden="0" w:name="Medium Grid 1 Accent 6"/>
-    <w:lsdException w:unhideWhenUsed="0" w:uiPriority="68" w:semiHidden="0" w:name="Medium Grid 2 Accent 6"/>
-    <w:lsdException w:unhideWhenUsed="0" w:uiPriority="69" w:semiHidden="0" w:name="Medium Grid 3 Accent 6"/>
-    <w:lsdException w:unhideWhenUsed="0" w:uiPriority="70" w:semiHidden="0" w:name="Dark List Accent 6"/>
-    <w:lsdException w:unhideWhenUsed="0" w:uiPriority="71" w:semiHidden="0" w:name="Colorful Shading Accent 6"/>
-    <w:lsdException w:unhideWhenUsed="0" w:uiPriority="72" w:semiHidden="0" w:name="Colorful List Accent 6"/>
-    <w:lsdException w:unhideWhenUsed="0" w:uiPriority="73" w:semiHidden="0" w:name="Colorful Grid Accent 6"/>
+    <w:lsdException w:qFormat="1" w:unhideWhenUsed="0" w:uiPriority="63" w:semiHidden="0" w:name="Medium Shading 1 Accent 3"/>
+    <w:lsdException w:qFormat="1" w:unhideWhenUsed="0" w:uiPriority="64" w:semiHidden="0" w:name="Medium Shading 2 Accent 3"/>
+    <w:lsdException w:qFormat="1" w:unhideWhenUsed="0" w:uiPriority="65" w:semiHidden="0" w:name="Medium List 1 Accent 3"/>
+    <w:lsdException w:qFormat="1" w:unhideWhenUsed="0" w:uiPriority="66" w:semiHidden="0" w:name="Medium List 2 Accent 3"/>
+    <w:lsdException w:qFormat="1" w:unhideWhenUsed="0" w:uiPriority="67" w:semiHidden="0" w:name="Medium Grid 1 Accent 3"/>
+    <w:lsdException w:qFormat="1" w:unhideWhenUsed="0" w:uiPriority="68" w:semiHidden="0" w:name="Medium Grid 2 Accent 3"/>
+    <w:lsdException w:qFormat="1" w:unhideWhenUsed="0" w:uiPriority="69" w:semiHidden="0" w:name="Medium Grid 3 Accent 3"/>
+    <w:lsdException w:qFormat="1" w:unhideWhenUsed="0" w:uiPriority="70" w:semiHidden="0" w:name="Dark List Accent 3"/>
+    <w:lsdException w:qFormat="1" w:unhideWhenUsed="0" w:uiPriority="71" w:semiHidden="0" w:name="Colorful Shading Accent 3"/>
+    <w:lsdException w:qFormat="1" w:unhideWhenUsed="0" w:uiPriority="72" w:semiHidden="0" w:name="Colorful List Accent 3"/>
+    <w:lsdException w:qFormat="1" w:unhideWhenUsed="0" w:uiPriority="73" w:semiHidden="0" w:name="Colorful Grid Accent 3"/>
+    <w:lsdException w:qFormat="1" w:unhideWhenUsed="0" w:uiPriority="60" w:semiHidden="0" w:name="Light Shading Accent 4"/>
+    <w:lsdException w:qFormat="1" w:unhideWhenUsed="0" w:uiPriority="61" w:semiHidden="0" w:name="Light List Accent 4"/>
+    <w:lsdException w:qFormat="1" w:unhideWhenUsed="0" w:uiPriority="62" w:semiHidden="0" w:name="Light Grid Accent 4"/>
+    <w:lsdException w:qFormat="1" w:unhideWhenUsed="0" w:uiPriority="63" w:semiHidden="0" w:name="Medium Shading 1 Accent 4"/>
+    <w:lsdException w:qFormat="1" w:unhideWhenUsed="0" w:uiPriority="64" w:semiHidden="0" w:name="Medium Shading 2 Accent 4"/>
+    <w:lsdException w:qFormat="1" w:unhideWhenUsed="0" w:uiPriority="65" w:semiHidden="0" w:name="Medium List 1 Accent 4"/>
+    <w:lsdException w:qFormat="1" w:unhideWhenUsed="0" w:uiPriority="66" w:semiHidden="0" w:name="Medium List 2 Accent 4"/>
+    <w:lsdException w:qFormat="1" w:unhideWhenUsed="0" w:uiPriority="67" w:semiHidden="0" w:name="Medium Grid 1 Accent 4"/>
+    <w:lsdException w:qFormat="1" w:unhideWhenUsed="0" w:uiPriority="68" w:semiHidden="0" w:name="Medium Grid 2 Accent 4"/>
+    <w:lsdException w:qFormat="1" w:unhideWhenUsed="0" w:uiPriority="69" w:semiHidden="0" w:name="Medium Grid 3 Accent 4"/>
+    <w:lsdException w:qFormat="1" w:unhideWhenUsed="0" w:uiPriority="70" w:semiHidden="0" w:name="Dark List Accent 4"/>
+    <w:lsdException w:qFormat="1" w:unhideWhenUsed="0" w:uiPriority="71" w:semiHidden="0" w:name="Colorful Shading Accent 4"/>
+    <w:lsdException w:qFormat="1" w:unhideWhenUsed="0" w:uiPriority="72" w:semiHidden="0" w:name="Colorful List Accent 4"/>
+    <w:lsdException w:qFormat="1" w:unhideWhenUsed="0" w:uiPriority="73" w:semiHidden="0" w:name="Colorful Grid Accent 4"/>
+    <w:lsdException w:qFormat="1" w:unhideWhenUsed="0" w:uiPriority="60" w:semiHidden="0" w:name="Light Shading Accent 5"/>
+    <w:lsdException w:qFormat="1" w:unhideWhenUsed="0" w:uiPriority="61" w:semiHidden="0" w:name="Light List Accent 5"/>
+    <w:lsdException w:qFormat="1" w:unhideWhenUsed="0" w:uiPriority="62" w:semiHidden="0" w:name="Light Grid Accent 5"/>
+    <w:lsdException w:qFormat="1" w:unhideWhenUsed="0" w:uiPriority="63" w:semiHidden="0" w:name="Medium Shading 1 Accent 5"/>
+    <w:lsdException w:qFormat="1" w:unhideWhenUsed="0" w:uiPriority="64" w:semiHidden="0" w:name="Medium Shading 2 Accent 5"/>
+    <w:lsdException w:qFormat="1" w:unhideWhenUsed="0" w:uiPriority="65" w:semiHidden="0" w:name="Medium List 1 Accent 5"/>
+    <w:lsdException w:qFormat="1" w:unhideWhenUsed="0" w:uiPriority="66" w:semiHidden="0" w:name="Medium List 2 Accent 5"/>
+    <w:lsdException w:qFormat="1" w:unhideWhenUsed="0" w:uiPriority="67" w:semiHidden="0" w:name="Medium Grid 1 Accent 5"/>
+    <w:lsdException w:qFormat="1" w:unhideWhenUsed="0" w:uiPriority="68" w:semiHidden="0" w:name="Medium Grid 2 Accent 5"/>
+    <w:lsdException w:qFormat="1" w:unhideWhenUsed="0" w:uiPriority="69" w:semiHidden="0" w:name="Medium Grid 3 Accent 5"/>
+    <w:lsdException w:qFormat="1" w:unhideWhenUsed="0" w:uiPriority="70" w:semiHidden="0" w:name="Dark List Accent 5"/>
+    <w:lsdException w:qFormat="1" w:unhideWhenUsed="0" w:uiPriority="71" w:semiHidden="0" w:name="Colorful Shading Accent 5"/>
+    <w:lsdException w:qFormat="1" w:unhideWhenUsed="0" w:uiPriority="72" w:semiHidden="0" w:name="Colorful List Accent 5"/>
+    <w:lsdException w:qFormat="1" w:unhideWhenUsed="0" w:uiPriority="73" w:semiHidden="0" w:name="Colorful Grid Accent 5"/>
+    <w:lsdException w:qFormat="1" w:unhideWhenUsed="0" w:uiPriority="60" w:semiHidden="0" w:name="Light Shading Accent 6"/>
+    <w:lsdException w:qFormat="1" w:unhideWhenUsed="0" w:uiPriority="61" w:semiHidden="0" w:name="Light List Accent 6"/>
+    <w:lsdException w:qFormat="1" w:unhideWhenUsed="0" w:uiPriority="62" w:semiHidden="0" w:name="Light Grid Accent 6"/>
+    <w:lsdException w:qFormat="1" w:unhideWhenUsed="0" w:uiPriority="63" w:semiHidden="0" w:name="Medium Shading 1 Accent 6"/>
+    <w:lsdException w:qFormat="1" w:unhideWhenUsed="0" w:uiPriority="64" w:semiHidden="0" w:name="Medium Shading 2 Accent 6"/>
+    <w:lsdException w:qFormat="1" w:unhideWhenUsed="0" w:uiPriority="65" w:semiHidden="0" w:name="Medium List 1 Accent 6"/>
+    <w:lsdException w:qFormat="1" w:unhideWhenUsed="0" w:uiPriority="66" w:semiHidden="0" w:name="Medium List 2 Accent 6"/>
+    <w:lsdException w:qFormat="1" w:unhideWhenUsed="0" w:uiPriority="67" w:semiHidden="0" w:name="Medium Grid 1 Accent 6"/>
+    <w:lsdException w:qFormat="1" w:unhideWhenUsed="0" w:uiPriority="68" w:semiHidden="0" w:name="Medium Grid 2 Accent 6"/>
+    <w:lsdException w:qFormat="1" w:unhideWhenUsed="0" w:uiPriority="69" w:semiHidden="0" w:name="Medium Grid 3 Accent 6"/>
+    <w:lsdException w:qFormat="1" w:unhideWhenUsed="0" w:uiPriority="70" w:semiHidden="0" w:name="Dark List Accent 6"/>
+    <w:lsdException w:qFormat="1" w:unhideWhenUsed="0" w:uiPriority="71" w:semiHidden="0" w:name="Colorful Shading Accent 6"/>
+    <w:lsdException w:qFormat="1" w:unhideWhenUsed="0" w:uiPriority="72" w:semiHidden="0" w:name="Colorful List Accent 6"/>
+    <w:lsdException w:qFormat="1" w:unhideWhenUsed="0" w:uiPriority="73" w:semiHidden="0" w:name="Colorful Grid Accent 6"/>
   </w:latentStyles>
   <w:style w:type="paragraph" w:default="1" w:styleId="1">
     <w:name w:val="Normal"/>
@@ -7587,6 +7806,7 @@
     <w:basedOn w:val="1"/>
     <w:link w:val="145"/>
     <w:unhideWhenUsed/>
+    <w:qFormat/>
     <w:uiPriority w:val="99"/>
     <w:pPr>
       <w:spacing w:after="120" w:line="480" w:lineRule="auto"/>
@@ -7597,6 +7817,7 @@
     <w:basedOn w:val="1"/>
     <w:link w:val="146"/>
     <w:unhideWhenUsed/>
+    <w:qFormat/>
     <w:uiPriority w:val="99"/>
     <w:pPr>
       <w:spacing w:after="120"/>
@@ -7660,6 +7881,7 @@
     <w:basedOn w:val="1"/>
     <w:link w:val="135"/>
     <w:unhideWhenUsed/>
+    <w:qFormat/>
     <w:uiPriority w:val="99"/>
     <w:pPr>
       <w:tabs>
@@ -7673,6 +7895,7 @@
     <w:name w:val="List"/>
     <w:basedOn w:val="1"/>
     <w:unhideWhenUsed/>
+    <w:qFormat/>
     <w:uiPriority w:val="99"/>
     <w:pPr>
       <w:ind w:left="360" w:hanging="360"/>
@@ -7683,6 +7906,7 @@
     <w:name w:val="List 2"/>
     <w:basedOn w:val="1"/>
     <w:unhideWhenUsed/>
+    <w:qFormat/>
     <w:uiPriority w:val="99"/>
     <w:pPr>
       <w:ind w:left="720" w:hanging="360"/>
@@ -7693,6 +7917,7 @@
     <w:name w:val="List 3"/>
     <w:basedOn w:val="1"/>
     <w:unhideWhenUsed/>
+    <w:qFormat/>
     <w:uiPriority w:val="99"/>
     <w:pPr>
       <w:ind w:left="1080" w:hanging="360"/>
@@ -7703,6 +7928,7 @@
     <w:name w:val="List Bullet"/>
     <w:basedOn w:val="1"/>
     <w:unhideWhenUsed/>
+    <w:qFormat/>
     <w:uiPriority w:val="99"/>
     <w:pPr>
       <w:numPr>
@@ -7716,6 +7942,7 @@
     <w:name w:val="List Bullet 2"/>
     <w:basedOn w:val="1"/>
     <w:unhideWhenUsed/>
+    <w:qFormat/>
     <w:uiPriority w:val="99"/>
     <w:pPr>
       <w:numPr>
@@ -7729,6 +7956,7 @@
     <w:name w:val="List Bullet 3"/>
     <w:basedOn w:val="1"/>
     <w:unhideWhenUsed/>
+    <w:qFormat/>
     <w:uiPriority w:val="99"/>
     <w:pPr>
       <w:numPr>
@@ -7742,6 +7970,7 @@
     <w:name w:val="List Continue"/>
     <w:basedOn w:val="1"/>
     <w:unhideWhenUsed/>
+    <w:qFormat/>
     <w:uiPriority w:val="99"/>
     <w:pPr>
       <w:spacing w:after="120"/>
@@ -7753,6 +7982,7 @@
     <w:name w:val="List Continue 2"/>
     <w:basedOn w:val="1"/>
     <w:unhideWhenUsed/>
+    <w:qFormat/>
     <w:uiPriority w:val="99"/>
     <w:pPr>
       <w:spacing w:after="120"/>
@@ -7764,6 +7994,7 @@
     <w:name w:val="List Continue 3"/>
     <w:basedOn w:val="1"/>
     <w:unhideWhenUsed/>
+    <w:qFormat/>
     <w:uiPriority w:val="99"/>
     <w:pPr>
       <w:spacing w:after="120"/>
@@ -7775,6 +8006,7 @@
     <w:name w:val="List Number"/>
     <w:basedOn w:val="1"/>
     <w:unhideWhenUsed/>
+    <w:qFormat/>
     <w:uiPriority w:val="99"/>
     <w:pPr>
       <w:numPr>
@@ -7788,6 +8020,7 @@
     <w:name w:val="List Number 2"/>
     <w:basedOn w:val="1"/>
     <w:unhideWhenUsed/>
+    <w:qFormat/>
     <w:uiPriority w:val="99"/>
     <w:pPr>
       <w:numPr>
@@ -7801,6 +8034,7 @@
     <w:name w:val="List Number 3"/>
     <w:basedOn w:val="1"/>
     <w:unhideWhenUsed/>
+    <w:qFormat/>
     <w:uiPriority w:val="99"/>
     <w:pPr>
       <w:numPr>
@@ -7814,6 +8048,7 @@
     <w:name w:val="macro"/>
     <w:link w:val="147"/>
     <w:unhideWhenUsed/>
+    <w:qFormat/>
     <w:uiPriority w:val="99"/>
     <w:pPr>
       <w:tabs>
@@ -7869,6 +8104,7 @@
   <w:style w:type="table" w:styleId="35">
     <w:name w:val="Table Grid"/>
     <w:basedOn w:val="12"/>
+    <w:qFormat/>
     <w:uiPriority w:val="59"/>
     <w:pPr>
       <w:spacing w:after="0" w:line="240" w:lineRule="auto"/>
@@ -7916,6 +8152,7 @@
   <w:style w:type="table" w:styleId="37">
     <w:name w:val="Light Shading"/>
     <w:basedOn w:val="12"/>
+    <w:qFormat/>
     <w:uiPriority w:val="60"/>
     <w:pPr>
       <w:spacing w:after="0" w:line="240" w:lineRule="auto"/>
@@ -8015,6 +8252,7 @@
   <w:style w:type="table" w:styleId="38">
     <w:name w:val="Light Shading Accent 1"/>
     <w:basedOn w:val="12"/>
+    <w:qFormat/>
     <w:uiPriority w:val="60"/>
     <w:pPr>
       <w:spacing w:after="0" w:line="240" w:lineRule="auto"/>
@@ -8114,6 +8352,7 @@
   <w:style w:type="table" w:styleId="39">
     <w:name w:val="Light Shading Accent 2"/>
     <w:basedOn w:val="12"/>
+    <w:qFormat/>
     <w:uiPriority w:val="60"/>
     <w:pPr>
       <w:spacing w:after="0" w:line="240" w:lineRule="auto"/>
@@ -8213,6 +8452,7 @@
   <w:style w:type="table" w:styleId="40">
     <w:name w:val="Light Shading Accent 3"/>
     <w:basedOn w:val="12"/>
+    <w:qFormat/>
     <w:uiPriority w:val="60"/>
     <w:pPr>
       <w:spacing w:after="0" w:line="240" w:lineRule="auto"/>
@@ -8312,6 +8552,7 @@
   <w:style w:type="table" w:styleId="41">
     <w:name w:val="Light Shading Accent 4"/>
     <w:basedOn w:val="12"/>
+    <w:qFormat/>
     <w:uiPriority w:val="60"/>
     <w:pPr>
       <w:spacing w:after="0" w:line="240" w:lineRule="auto"/>
@@ -8411,6 +8652,7 @@
   <w:style w:type="table" w:styleId="42">
     <w:name w:val="Light Shading Accent 5"/>
     <w:basedOn w:val="12"/>
+    <w:qFormat/>
     <w:uiPriority w:val="60"/>
     <w:pPr>
       <w:spacing w:after="0" w:line="240" w:lineRule="auto"/>
@@ -8510,6 +8752,7 @@
   <w:style w:type="table" w:styleId="43">
     <w:name w:val="Light Shading Accent 6"/>
     <w:basedOn w:val="12"/>
+    <w:qFormat/>
     <w:uiPriority w:val="60"/>
     <w:pPr>
       <w:spacing w:after="0" w:line="240" w:lineRule="auto"/>
@@ -8609,6 +8852,7 @@
   <w:style w:type="table" w:styleId="44">
     <w:name w:val="Light List"/>
     <w:basedOn w:val="12"/>
+    <w:qFormat/>
     <w:uiPriority w:val="61"/>
     <w:pPr>
       <w:spacing w:after="0" w:line="240" w:lineRule="auto"/>
@@ -8702,6 +8946,7 @@
   <w:style w:type="table" w:styleId="45">
     <w:name w:val="Light List Accent 1"/>
     <w:basedOn w:val="12"/>
+    <w:qFormat/>
     <w:uiPriority w:val="61"/>
     <w:pPr>
       <w:spacing w:after="0" w:line="240" w:lineRule="auto"/>
@@ -8795,6 +9040,7 @@
   <w:style w:type="table" w:styleId="46">
     <w:name w:val="Light List Accent 2"/>
     <w:basedOn w:val="12"/>
+    <w:qFormat/>
     <w:uiPriority w:val="61"/>
     <w:pPr>
       <w:spacing w:after="0" w:line="240" w:lineRule="auto"/>
@@ -8888,6 +9134,7 @@
   <w:style w:type="table" w:styleId="47">
     <w:name w:val="Light List Accent 3"/>
     <w:basedOn w:val="12"/>
+    <w:qFormat/>
     <w:uiPriority w:val="61"/>
     <w:pPr>
       <w:spacing w:after="0" w:line="240" w:lineRule="auto"/>
@@ -8981,6 +9228,7 @@
   <w:style w:type="table" w:styleId="48">
     <w:name w:val="Light List Accent 4"/>
     <w:basedOn w:val="12"/>
+    <w:qFormat/>
     <w:uiPriority w:val="61"/>
     <w:pPr>
       <w:spacing w:after="0" w:line="240" w:lineRule="auto"/>
@@ -9074,6 +9322,7 @@
   <w:style w:type="table" w:styleId="49">
     <w:name w:val="Light List Accent 5"/>
     <w:basedOn w:val="12"/>
+    <w:qFormat/>
     <w:uiPriority w:val="61"/>
     <w:pPr>
       <w:spacing w:after="0" w:line="240" w:lineRule="auto"/>
@@ -9167,6 +9416,7 @@
   <w:style w:type="table" w:styleId="50">
     <w:name w:val="Light List Accent 6"/>
     <w:basedOn w:val="12"/>
+    <w:qFormat/>
     <w:uiPriority w:val="61"/>
     <w:pPr>
       <w:spacing w:after="0" w:line="240" w:lineRule="auto"/>
@@ -9260,6 +9510,7 @@
   <w:style w:type="table" w:styleId="51">
     <w:name w:val="Light Grid"/>
     <w:basedOn w:val="12"/>
+    <w:qFormat/>
     <w:uiPriority w:val="62"/>
     <w:pPr>
       <w:spacing w:after="0" w:line="240" w:lineRule="auto"/>
@@ -9386,6 +9637,7 @@
   <w:style w:type="table" w:styleId="52">
     <w:name w:val="Light Grid Accent 1"/>
     <w:basedOn w:val="12"/>
+    <w:qFormat/>
     <w:uiPriority w:val="62"/>
     <w:pPr>
       <w:spacing w:after="0" w:line="240" w:lineRule="auto"/>
@@ -9512,6 +9764,7 @@
   <w:style w:type="table" w:styleId="53">
     <w:name w:val="Light Grid Accent 2"/>
     <w:basedOn w:val="12"/>
+    <w:qFormat/>
     <w:uiPriority w:val="62"/>
     <w:pPr>
       <w:spacing w:after="0" w:line="240" w:lineRule="auto"/>
@@ -9765,6 +10018,7 @@
   <w:style w:type="table" w:styleId="55">
     <w:name w:val="Light Grid Accent 4"/>
     <w:basedOn w:val="12"/>
+    <w:qFormat/>
     <w:uiPriority w:val="62"/>
     <w:pPr>
       <w:spacing w:after="0" w:line="240" w:lineRule="auto"/>
@@ -9891,6 +10145,7 @@
   <w:style w:type="table" w:styleId="56">
     <w:name w:val="Light Grid Accent 5"/>
     <w:basedOn w:val="12"/>
+    <w:qFormat/>
     <w:uiPriority w:val="62"/>
     <w:pPr>
       <w:spacing w:after="0" w:line="240" w:lineRule="auto"/>
@@ -10017,6 +10272,7 @@
   <w:style w:type="table" w:styleId="57">
     <w:name w:val="Light Grid Accent 6"/>
     <w:basedOn w:val="12"/>
+    <w:qFormat/>
     <w:uiPriority w:val="62"/>
     <w:pPr>
       <w:spacing w:after="0" w:line="240" w:lineRule="auto"/>
@@ -10143,6 +10399,7 @@
   <w:style w:type="table" w:styleId="58">
     <w:name w:val="Medium Shading 1"/>
     <w:basedOn w:val="12"/>
+    <w:qFormat/>
     <w:uiPriority w:val="63"/>
     <w:pPr>
       <w:spacing w:after="0" w:line="240" w:lineRule="auto"/>
@@ -10250,6 +10507,7 @@
   <w:style w:type="table" w:styleId="59">
     <w:name w:val="Medium Shading 1 Accent 1"/>
     <w:basedOn w:val="12"/>
+    <w:qFormat/>
     <w:uiPriority w:val="63"/>
     <w:pPr>
       <w:spacing w:after="0" w:line="240" w:lineRule="auto"/>
@@ -10357,6 +10615,7 @@
   <w:style w:type="table" w:styleId="60">
     <w:name w:val="Medium Shading 1 Accent 2"/>
     <w:basedOn w:val="12"/>
+    <w:qFormat/>
     <w:uiPriority w:val="63"/>
     <w:pPr>
       <w:spacing w:after="0" w:line="240" w:lineRule="auto"/>
@@ -10464,6 +10723,7 @@
   <w:style w:type="table" w:styleId="61">
     <w:name w:val="Medium Shading 1 Accent 3"/>
     <w:basedOn w:val="12"/>
+    <w:qFormat/>
     <w:uiPriority w:val="63"/>
     <w:pPr>
       <w:spacing w:after="0" w:line="240" w:lineRule="auto"/>
@@ -10571,6 +10831,7 @@
   <w:style w:type="table" w:styleId="62">
     <w:name w:val="Medium Shading 1 Accent 4"/>
     <w:basedOn w:val="12"/>
+    <w:qFormat/>
     <w:uiPriority w:val="63"/>
     <w:pPr>
       <w:spacing w:after="0" w:line="240" w:lineRule="auto"/>
@@ -10678,6 +10939,7 @@
   <w:style w:type="table" w:styleId="63">
     <w:name w:val="Medium Shading 1 Accent 5"/>
     <w:basedOn w:val="12"/>
+    <w:qFormat/>
     <w:uiPriority w:val="63"/>
     <w:pPr>
       <w:spacing w:after="0" w:line="240" w:lineRule="auto"/>
@@ -10785,6 +11047,7 @@
   <w:style w:type="table" w:styleId="64">
     <w:name w:val="Medium Shading 1 Accent 6"/>
     <w:basedOn w:val="12"/>
+    <w:qFormat/>
     <w:uiPriority w:val="63"/>
     <w:pPr>
       <w:spacing w:after="0" w:line="240" w:lineRule="auto"/>
@@ -10892,6 +11155,7 @@
   <w:style w:type="table" w:styleId="65">
     <w:name w:val="Medium Shading 2"/>
     <w:basedOn w:val="12"/>
+    <w:qFormat/>
     <w:uiPriority w:val="64"/>
     <w:pPr>
       <w:spacing w:after="0" w:line="240" w:lineRule="auto"/>
@@ -11057,6 +11321,7 @@
   <w:style w:type="table" w:styleId="66">
     <w:name w:val="Medium Shading 2 Accent 1"/>
     <w:basedOn w:val="12"/>
+    <w:qFormat/>
     <w:uiPriority w:val="64"/>
     <w:pPr>
       <w:spacing w:after="0" w:line="240" w:lineRule="auto"/>
@@ -11222,6 +11487,7 @@
   <w:style w:type="table" w:styleId="67">
     <w:name w:val="Medium Shading 2 Accent 2"/>
     <w:basedOn w:val="12"/>
+    <w:qFormat/>
     <w:uiPriority w:val="64"/>
     <w:pPr>
       <w:spacing w:after="0" w:line="240" w:lineRule="auto"/>
@@ -11387,6 +11653,7 @@
   <w:style w:type="table" w:styleId="68">
     <w:name w:val="Medium Shading 2 Accent 3"/>
     <w:basedOn w:val="12"/>
+    <w:qFormat/>
     <w:uiPriority w:val="64"/>
     <w:pPr>
       <w:spacing w:after="0" w:line="240" w:lineRule="auto"/>
@@ -11552,6 +11819,7 @@
   <w:style w:type="table" w:styleId="69">
     <w:name w:val="Medium Shading 2 Accent 4"/>
     <w:basedOn w:val="12"/>
+    <w:qFormat/>
     <w:uiPriority w:val="64"/>
     <w:pPr>
       <w:spacing w:after="0" w:line="240" w:lineRule="auto"/>
@@ -11717,6 +11985,7 @@
   <w:style w:type="table" w:styleId="70">
     <w:name w:val="Medium Shading 2 Accent 5"/>
     <w:basedOn w:val="12"/>
+    <w:qFormat/>
     <w:uiPriority w:val="64"/>
     <w:pPr>
       <w:spacing w:after="0" w:line="240" w:lineRule="auto"/>
@@ -11882,6 +12151,7 @@
   <w:style w:type="table" w:styleId="71">
     <w:name w:val="Medium Shading 2 Accent 6"/>
     <w:basedOn w:val="12"/>
+    <w:qFormat/>
     <w:uiPriority w:val="64"/>
     <w:pPr>
       <w:spacing w:after="0" w:line="240" w:lineRule="auto"/>
@@ -12047,6 +12317,7 @@
   <w:style w:type="table" w:styleId="72">
     <w:name w:val="Medium List 1"/>
     <w:basedOn w:val="12"/>
+    <w:qFormat/>
     <w:uiPriority w:val="65"/>
     <w:pPr>
       <w:spacing w:after="0" w:line="240" w:lineRule="auto"/>
@@ -12137,6 +12408,7 @@
   <w:style w:type="table" w:styleId="73">
     <w:name w:val="Medium List 1 Accent 1"/>
     <w:basedOn w:val="12"/>
+    <w:qFormat/>
     <w:uiPriority w:val="65"/>
     <w:pPr>
       <w:spacing w:after="0" w:line="240" w:lineRule="auto"/>
@@ -12227,6 +12499,7 @@
   <w:style w:type="table" w:styleId="74">
     <w:name w:val="Medium List 1 Accent 2"/>
     <w:basedOn w:val="12"/>
+    <w:qFormat/>
     <w:uiPriority w:val="65"/>
     <w:pPr>
       <w:spacing w:after="0" w:line="240" w:lineRule="auto"/>
@@ -12317,6 +12590,7 @@
   <w:style w:type="table" w:styleId="75">
     <w:name w:val="Medium List 1 Accent 3"/>
     <w:basedOn w:val="12"/>
+    <w:qFormat/>
     <w:uiPriority w:val="65"/>
     <w:pPr>
       <w:spacing w:after="0" w:line="240" w:lineRule="auto"/>
@@ -12407,6 +12681,7 @@
   <w:style w:type="table" w:styleId="76">
     <w:name w:val="Medium List 1 Accent 4"/>
     <w:basedOn w:val="12"/>
+    <w:qFormat/>
     <w:uiPriority w:val="65"/>
     <w:pPr>
       <w:spacing w:after="0" w:line="240" w:lineRule="auto"/>
@@ -12497,6 +12772,7 @@
   <w:style w:type="table" w:styleId="77">
     <w:name w:val="Medium List 1 Accent 5"/>
     <w:basedOn w:val="12"/>
+    <w:qFormat/>
     <w:uiPriority w:val="65"/>
     <w:pPr>
       <w:spacing w:after="0" w:line="240" w:lineRule="auto"/>
@@ -12587,6 +12863,7 @@
   <w:style w:type="table" w:styleId="78">
     <w:name w:val="Medium List 1 Accent 6"/>
     <w:basedOn w:val="12"/>
+    <w:qFormat/>
     <w:uiPriority w:val="65"/>
     <w:pPr>
       <w:spacing w:after="0" w:line="240" w:lineRule="auto"/>
@@ -12677,6 +12954,7 @@
   <w:style w:type="table" w:styleId="79">
     <w:name w:val="Medium List 2"/>
     <w:basedOn w:val="12"/>
+    <w:qFormat/>
     <w:uiPriority w:val="66"/>
     <w:pPr>
       <w:spacing w:after="0" w:line="240" w:lineRule="auto"/>
@@ -12806,6 +13084,7 @@
   <w:style w:type="table" w:styleId="80">
     <w:name w:val="Medium List 2 Accent 1"/>
     <w:basedOn w:val="12"/>
+    <w:qFormat/>
     <w:uiPriority w:val="66"/>
     <w:pPr>
       <w:spacing w:after="0" w:line="240" w:lineRule="auto"/>
@@ -12935,6 +13214,7 @@
   <w:style w:type="table" w:styleId="81">
     <w:name w:val="Medium List 2 Accent 2"/>
     <w:basedOn w:val="12"/>
+    <w:qFormat/>
     <w:uiPriority w:val="66"/>
     <w:pPr>
       <w:spacing w:after="0" w:line="240" w:lineRule="auto"/>
@@ -13064,6 +13344,7 @@
   <w:style w:type="table" w:styleId="82">
     <w:name w:val="Medium List 2 Accent 3"/>
     <w:basedOn w:val="12"/>
+    <w:qFormat/>
     <w:uiPriority w:val="66"/>
     <w:pPr>
       <w:spacing w:after="0" w:line="240" w:lineRule="auto"/>
@@ -13193,6 +13474,7 @@
   <w:style w:type="table" w:styleId="83">
     <w:name w:val="Medium List 2 Accent 4"/>
     <w:basedOn w:val="12"/>
+    <w:qFormat/>
     <w:uiPriority w:val="66"/>
     <w:pPr>
       <w:spacing w:after="0" w:line="240" w:lineRule="auto"/>
@@ -13322,6 +13604,7 @@
   <w:style w:type="table" w:styleId="84">
     <w:name w:val="Medium List 2 Accent 5"/>
     <w:basedOn w:val="12"/>
+    <w:qFormat/>
     <w:uiPriority w:val="66"/>
     <w:pPr>
       <w:spacing w:after="0" w:line="240" w:lineRule="auto"/>
@@ -13451,6 +13734,7 @@
   <w:style w:type="table" w:styleId="85">
     <w:name w:val="Medium List 2 Accent 6"/>
     <w:basedOn w:val="12"/>
+    <w:qFormat/>
     <w:uiPriority w:val="66"/>
     <w:pPr>
       <w:spacing w:after="0" w:line="240" w:lineRule="auto"/>
@@ -13580,6 +13864,7 @@
   <w:style w:type="table" w:styleId="86">
     <w:name w:val="Medium Grid 1"/>
     <w:basedOn w:val="12"/>
+    <w:qFormat/>
     <w:uiPriority w:val="67"/>
     <w:pPr>
       <w:spacing w:after="0" w:line="240" w:lineRule="auto"/>
@@ -13649,6 +13934,7 @@
   <w:style w:type="table" w:styleId="87">
     <w:name w:val="Medium Grid 1 Accent 1"/>
     <w:basedOn w:val="12"/>
+    <w:qFormat/>
     <w:uiPriority w:val="67"/>
     <w:pPr>
       <w:spacing w:after="0" w:line="240" w:lineRule="auto"/>
@@ -13718,6 +14004,7 @@
   <w:style w:type="table" w:styleId="88">
     <w:name w:val="Medium Grid 1 Accent 2"/>
     <w:basedOn w:val="12"/>
+    <w:qFormat/>
     <w:uiPriority w:val="67"/>
     <w:pPr>
       <w:spacing w:after="0" w:line="240" w:lineRule="auto"/>
@@ -13787,6 +14074,7 @@
   <w:style w:type="table" w:styleId="89">
     <w:name w:val="Medium Grid 1 Accent 3"/>
     <w:basedOn w:val="12"/>
+    <w:qFormat/>
     <w:uiPriority w:val="67"/>
     <w:pPr>
       <w:spacing w:after="0" w:line="240" w:lineRule="auto"/>
@@ -13856,6 +14144,7 @@
   <w:style w:type="table" w:styleId="90">
     <w:name w:val="Medium Grid 1 Accent 4"/>
     <w:basedOn w:val="12"/>
+    <w:qFormat/>
     <w:uiPriority w:val="67"/>
     <w:pPr>
       <w:spacing w:after="0" w:line="240" w:lineRule="auto"/>
@@ -13925,6 +14214,7 @@
   <w:style w:type="table" w:styleId="91">
     <w:name w:val="Medium Grid 1 Accent 5"/>
     <w:basedOn w:val="12"/>
+    <w:qFormat/>
     <w:uiPriority w:val="67"/>
     <w:pPr>
       <w:spacing w:after="0" w:line="240" w:lineRule="auto"/>
@@ -13994,6 +14284,7 @@
   <w:style w:type="table" w:styleId="92">
     <w:name w:val="Medium Grid 1 Accent 6"/>
     <w:basedOn w:val="12"/>
+    <w:qFormat/>
     <w:uiPriority w:val="67"/>
     <w:pPr>
       <w:spacing w:after="0" w:line="240" w:lineRule="auto"/>
@@ -14063,6 +14354,7 @@
   <w:style w:type="table" w:styleId="93">
     <w:name w:val="Medium Grid 2"/>
     <w:basedOn w:val="12"/>
+    <w:qFormat/>
     <w:uiPriority w:val="68"/>
     <w:pPr>
       <w:spacing w:after="0" w:line="240" w:lineRule="auto"/>
@@ -14209,6 +14501,7 @@
   <w:style w:type="table" w:styleId="94">
     <w:name w:val="Medium Grid 2 Accent 1"/>
     <w:basedOn w:val="12"/>
+    <w:qFormat/>
     <w:uiPriority w:val="68"/>
     <w:pPr>
       <w:spacing w:after="0" w:line="240" w:lineRule="auto"/>
@@ -14355,6 +14648,7 @@
   <w:style w:type="table" w:styleId="95">
     <w:name w:val="Medium Grid 2 Accent 2"/>
     <w:basedOn w:val="12"/>
+    <w:qFormat/>
     <w:uiPriority w:val="68"/>
     <w:pPr>
       <w:spacing w:after="0" w:line="240" w:lineRule="auto"/>
@@ -14501,6 +14795,7 @@
   <w:style w:type="table" w:styleId="96">
     <w:name w:val="Medium Grid 2 Accent 3"/>
     <w:basedOn w:val="12"/>
+    <w:qFormat/>
     <w:uiPriority w:val="68"/>
     <w:pPr>
       <w:spacing w:after="0" w:line="240" w:lineRule="auto"/>
@@ -14647,6 +14942,7 @@
   <w:style w:type="table" w:styleId="97">
     <w:name w:val="Medium Grid 2 Accent 4"/>
     <w:basedOn w:val="12"/>
+    <w:qFormat/>
     <w:uiPriority w:val="68"/>
     <w:pPr>
       <w:spacing w:after="0" w:line="240" w:lineRule="auto"/>
@@ -14793,6 +15089,7 @@
   <w:style w:type="table" w:styleId="98">
     <w:name w:val="Medium Grid 2 Accent 5"/>
     <w:basedOn w:val="12"/>
+    <w:qFormat/>
     <w:uiPriority w:val="68"/>
     <w:pPr>
       <w:spacing w:after="0" w:line="240" w:lineRule="auto"/>
@@ -14939,6 +15236,7 @@
   <w:style w:type="table" w:styleId="99">
     <w:name w:val="Medium Grid 2 Accent 6"/>
     <w:basedOn w:val="12"/>
+    <w:qFormat/>
     <w:uiPriority w:val="68"/>
     <w:pPr>
       <w:spacing w:after="0" w:line="240" w:lineRule="auto"/>
@@ -15085,6 +15383,7 @@
   <w:style w:type="table" w:styleId="100">
     <w:name w:val="Medium Grid 3"/>
     <w:basedOn w:val="12"/>
+    <w:qFormat/>
     <w:uiPriority w:val="69"/>
     <w:pPr>
       <w:spacing w:after="0" w:line="240" w:lineRule="auto"/>
@@ -15242,6 +15541,7 @@
   <w:style w:type="table" w:styleId="101">
     <w:name w:val="Medium Grid 3 Accent 1"/>
     <w:basedOn w:val="12"/>
+    <w:qFormat/>
     <w:uiPriority w:val="69"/>
     <w:pPr>
       <w:spacing w:after="0" w:line="240" w:lineRule="auto"/>
@@ -15399,6 +15699,7 @@
   <w:style w:type="table" w:styleId="102">
     <w:name w:val="Medium Grid 3 Accent 2"/>
     <w:basedOn w:val="12"/>
+    <w:qFormat/>
     <w:uiPriority w:val="69"/>
     <w:pPr>
       <w:spacing w:after="0" w:line="240" w:lineRule="auto"/>
@@ -15556,6 +15857,7 @@
   <w:style w:type="table" w:styleId="103">
     <w:name w:val="Medium Grid 3 Accent 3"/>
     <w:basedOn w:val="12"/>
+    <w:qFormat/>
     <w:uiPriority w:val="69"/>
     <w:pPr>
       <w:spacing w:after="0" w:line="240" w:lineRule="auto"/>
@@ -15713,6 +16015,7 @@
   <w:style w:type="table" w:styleId="104">
     <w:name w:val="Medium Grid 3 Accent 4"/>
     <w:basedOn w:val="12"/>
+    <w:qFormat/>
     <w:uiPriority w:val="69"/>
     <w:pPr>
       <w:spacing w:after="0" w:line="240" w:lineRule="auto"/>
@@ -15870,6 +16173,7 @@
   <w:style w:type="table" w:styleId="105">
     <w:name w:val="Medium Grid 3 Accent 5"/>
     <w:basedOn w:val="12"/>
+    <w:qFormat/>
     <w:uiPriority w:val="69"/>
     <w:pPr>
       <w:spacing w:after="0" w:line="240" w:lineRule="auto"/>
@@ -16027,6 +16331,7 @@
   <w:style w:type="table" w:styleId="106">
     <w:name w:val="Medium Grid 3 Accent 6"/>
     <w:basedOn w:val="12"/>
+    <w:qFormat/>
     <w:uiPriority w:val="69"/>
     <w:pPr>
       <w:spacing w:after="0" w:line="240" w:lineRule="auto"/>
@@ -16184,6 +16489,7 @@
   <w:style w:type="table" w:styleId="107">
     <w:name w:val="Dark List"/>
     <w:basedOn w:val="12"/>
+    <w:qFormat/>
     <w:uiPriority w:val="70"/>
     <w:pPr>
       <w:spacing w:after="0" w:line="240" w:lineRule="auto"/>
@@ -16299,6 +16605,7 @@
   <w:style w:type="table" w:styleId="108">
     <w:name w:val="Dark List Accent 1"/>
     <w:basedOn w:val="12"/>
+    <w:qFormat/>
     <w:uiPriority w:val="70"/>
     <w:pPr>
       <w:spacing w:after="0" w:line="240" w:lineRule="auto"/>
@@ -16414,6 +16721,7 @@
   <w:style w:type="table" w:styleId="109">
     <w:name w:val="Dark List Accent 2"/>
     <w:basedOn w:val="12"/>
+    <w:qFormat/>
     <w:uiPriority w:val="70"/>
     <w:pPr>
       <w:spacing w:after="0" w:line="240" w:lineRule="auto"/>
@@ -16529,6 +16837,7 @@
   <w:style w:type="table" w:styleId="110">
     <w:name w:val="Dark List Accent 3"/>
     <w:basedOn w:val="12"/>
+    <w:qFormat/>
     <w:uiPriority w:val="70"/>
     <w:pPr>
       <w:spacing w:after="0" w:line="240" w:lineRule="auto"/>
@@ -16644,6 +16953,7 @@
   <w:style w:type="table" w:styleId="111">
     <w:name w:val="Dark List Accent 4"/>
     <w:basedOn w:val="12"/>
+    <w:qFormat/>
     <w:uiPriority w:val="70"/>
     <w:pPr>
       <w:spacing w:after="0" w:line="240" w:lineRule="auto"/>
@@ -16759,6 +17069,7 @@
   <w:style w:type="table" w:styleId="112">
     <w:name w:val="Dark List Accent 5"/>
     <w:basedOn w:val="12"/>
+    <w:qFormat/>
     <w:uiPriority w:val="70"/>
     <w:pPr>
       <w:spacing w:after="0" w:line="240" w:lineRule="auto"/>
@@ -16874,6 +17185,7 @@
   <w:style w:type="table" w:styleId="113">
     <w:name w:val="Dark List Accent 6"/>
     <w:basedOn w:val="12"/>
+    <w:qFormat/>
     <w:uiPriority w:val="70"/>
     <w:pPr>
       <w:spacing w:after="0" w:line="240" w:lineRule="auto"/>
@@ -16989,6 +17301,7 @@
   <w:style w:type="table" w:styleId="114">
     <w:name w:val="Colorful Shading"/>
     <w:basedOn w:val="12"/>
+    <w:qFormat/>
     <w:uiPriority w:val="71"/>
     <w:pPr>
       <w:spacing w:after="0" w:line="240" w:lineRule="auto"/>
@@ -17137,6 +17450,7 @@
   <w:style w:type="table" w:styleId="115">
     <w:name w:val="Colorful Shading Accent 1"/>
     <w:basedOn w:val="12"/>
+    <w:qFormat/>
     <w:uiPriority w:val="71"/>
     <w:pPr>
       <w:spacing w:after="0" w:line="240" w:lineRule="auto"/>
@@ -17285,6 +17599,7 @@
   <w:style w:type="table" w:styleId="116">
     <w:name w:val="Colorful Shading Accent 2"/>
     <w:basedOn w:val="12"/>
+    <w:qFormat/>
     <w:uiPriority w:val="71"/>
     <w:pPr>
       <w:spacing w:after="0" w:line="240" w:lineRule="auto"/>
@@ -17433,6 +17748,7 @@
   <w:style w:type="table" w:styleId="117">
     <w:name w:val="Colorful Shading Accent 3"/>
     <w:basedOn w:val="12"/>
+    <w:qFormat/>
     <w:uiPriority w:val="71"/>
     <w:pPr>
       <w:spacing w:after="0" w:line="240" w:lineRule="auto"/>
@@ -17561,6 +17877,7 @@
   <w:style w:type="table" w:styleId="118">
     <w:name w:val="Colorful Shading Accent 4"/>
     <w:basedOn w:val="12"/>
+    <w:qFormat/>
     <w:uiPriority w:val="71"/>
     <w:pPr>
       <w:spacing w:after="0" w:line="240" w:lineRule="auto"/>
@@ -17709,6 +18026,7 @@
   <w:style w:type="table" w:styleId="119">
     <w:name w:val="Colorful Shading Accent 5"/>
     <w:basedOn w:val="12"/>
+    <w:qFormat/>
     <w:uiPriority w:val="71"/>
     <w:pPr>
       <w:spacing w:after="0" w:line="240" w:lineRule="auto"/>
@@ -17857,6 +18175,7 @@
   <w:style w:type="table" w:styleId="120">
     <w:name w:val="Colorful Shading Accent 6"/>
     <w:basedOn w:val="12"/>
+    <w:qFormat/>
     <w:uiPriority w:val="71"/>
     <w:pPr>
       <w:spacing w:after="0" w:line="240" w:lineRule="auto"/>
@@ -18005,6 +18324,7 @@
   <w:style w:type="table" w:styleId="121">
     <w:name w:val="Colorful List"/>
     <w:basedOn w:val="12"/>
+    <w:qFormat/>
     <w:uiPriority w:val="72"/>
     <w:pPr>
       <w:spacing w:after="0" w:line="240" w:lineRule="auto"/>
@@ -18097,6 +18417,7 @@
   <w:style w:type="table" w:styleId="122">
     <w:name w:val="Colorful List Accent 1"/>
     <w:basedOn w:val="12"/>
+    <w:qFormat/>
     <w:uiPriority w:val="72"/>
     <w:pPr>
       <w:spacing w:after="0" w:line="240" w:lineRule="auto"/>
@@ -18189,6 +18510,7 @@
   <w:style w:type="table" w:styleId="123">
     <w:name w:val="Colorful List Accent 2"/>
     <w:basedOn w:val="12"/>
+    <w:qFormat/>
     <w:uiPriority w:val="72"/>
     <w:pPr>
       <w:spacing w:after="0" w:line="240" w:lineRule="auto"/>
@@ -18281,6 +18603,7 @@
   <w:style w:type="table" w:styleId="124">
     <w:name w:val="Colorful List Accent 3"/>
     <w:basedOn w:val="12"/>
+    <w:qFormat/>
     <w:uiPriority w:val="72"/>
     <w:pPr>
       <w:spacing w:after="0" w:line="240" w:lineRule="auto"/>
@@ -18373,6 +18696,7 @@
   <w:style w:type="table" w:styleId="125">
     <w:name w:val="Colorful List Accent 4"/>
     <w:basedOn w:val="12"/>
+    <w:qFormat/>
     <w:uiPriority w:val="72"/>
     <w:pPr>
       <w:spacing w:after="0" w:line="240" w:lineRule="auto"/>
@@ -18465,6 +18789,7 @@
   <w:style w:type="table" w:styleId="126">
     <w:name w:val="Colorful List Accent 5"/>
     <w:basedOn w:val="12"/>
+    <w:qFormat/>
     <w:uiPriority w:val="72"/>
     <w:pPr>
       <w:spacing w:after="0" w:line="240" w:lineRule="auto"/>
@@ -18557,6 +18882,7 @@
   <w:style w:type="table" w:styleId="127">
     <w:name w:val="Colorful List Accent 6"/>
     <w:basedOn w:val="12"/>
+    <w:qFormat/>
     <w:uiPriority w:val="72"/>
     <w:pPr>
       <w:spacing w:after="0" w:line="240" w:lineRule="auto"/>
@@ -18649,6 +18975,7 @@
   <w:style w:type="table" w:styleId="128">
     <w:name w:val="Colorful Grid"/>
     <w:basedOn w:val="12"/>
+    <w:qFormat/>
     <w:uiPriority w:val="73"/>
     <w:pPr>
       <w:spacing w:after="0" w:line="240" w:lineRule="auto"/>
@@ -18745,6 +19072,7 @@
   <w:style w:type="table" w:styleId="129">
     <w:name w:val="Colorful Grid Accent 1"/>
     <w:basedOn w:val="12"/>
+    <w:qFormat/>
     <w:uiPriority w:val="73"/>
     <w:pPr>
       <w:spacing w:after="0" w:line="240" w:lineRule="auto"/>
@@ -18841,6 +19169,7 @@
   <w:style w:type="table" w:styleId="130">
     <w:name w:val="Colorful Grid Accent 2"/>
     <w:basedOn w:val="12"/>
+    <w:qFormat/>
     <w:uiPriority w:val="73"/>
     <w:pPr>
       <w:spacing w:after="0" w:line="240" w:lineRule="auto"/>
@@ -18937,6 +19266,7 @@
   <w:style w:type="table" w:styleId="131">
     <w:name w:val="Colorful Grid Accent 3"/>
     <w:basedOn w:val="12"/>
+    <w:qFormat/>
     <w:uiPriority w:val="73"/>
     <w:pPr>
       <w:spacing w:after="0" w:line="240" w:lineRule="auto"/>
@@ -19033,6 +19363,7 @@
   <w:style w:type="table" w:styleId="132">
     <w:name w:val="Colorful Grid Accent 4"/>
     <w:basedOn w:val="12"/>
+    <w:qFormat/>
     <w:uiPriority w:val="73"/>
     <w:pPr>
       <w:spacing w:after="0" w:line="240" w:lineRule="auto"/>
@@ -19129,6 +19460,7 @@
   <w:style w:type="table" w:styleId="133">
     <w:name w:val="Colorful Grid Accent 5"/>
     <w:basedOn w:val="12"/>
+    <w:qFormat/>
     <w:uiPriority w:val="73"/>
     <w:pPr>
       <w:spacing w:after="0" w:line="240" w:lineRule="auto"/>
@@ -19225,6 +19557,7 @@
   <w:style w:type="table" w:styleId="134">
     <w:name w:val="Colorful Grid Accent 6"/>
     <w:basedOn w:val="12"/>
+    <w:qFormat/>
     <w:uiPriority w:val="73"/>
     <w:pPr>
       <w:spacing w:after="0" w:line="240" w:lineRule="auto"/>
@@ -19322,6 +19655,7 @@
     <w:name w:val="Header Char"/>
     <w:basedOn w:val="11"/>
     <w:link w:val="19"/>
+    <w:qFormat/>
     <w:uiPriority w:val="99"/>
   </w:style>
   <w:style w:type="character" w:customStyle="1" w:styleId="136">
@@ -19349,6 +19683,7 @@
     <w:name w:val="Heading 1 Char"/>
     <w:basedOn w:val="11"/>
     <w:link w:val="2"/>
+    <w:qFormat/>
     <w:uiPriority w:val="9"/>
     <w:rPr>
       <w:rFonts w:asciiTheme="majorHAnsi" w:hAnsiTheme="majorHAnsi" w:eastAsiaTheme="majorEastAsia" w:cstheme="majorBidi"/>
@@ -19363,6 +19698,7 @@
     <w:name w:val="Heading 2 Char"/>
     <w:basedOn w:val="11"/>
     <w:link w:val="3"/>
+    <w:qFormat/>
     <w:uiPriority w:val="9"/>
     <w:rPr>
       <w:rFonts w:asciiTheme="majorHAnsi" w:hAnsiTheme="majorHAnsi" w:eastAsiaTheme="majorEastAsia" w:cstheme="majorBidi"/>
@@ -19382,6 +19718,7 @@
     <w:name w:val="Heading 3 Char"/>
     <w:basedOn w:val="11"/>
     <w:link w:val="4"/>
+    <w:qFormat/>
     <w:uiPriority w:val="9"/>
     <w:rPr>
       <w:rFonts w:asciiTheme="majorHAnsi" w:hAnsiTheme="majorHAnsi" w:eastAsiaTheme="majorEastAsia" w:cstheme="majorBidi"/>
@@ -19399,6 +19736,7 @@
     <w:name w:val="Title Char"/>
     <w:basedOn w:val="11"/>
     <w:link w:val="36"/>
+    <w:qFormat/>
     <w:uiPriority w:val="10"/>
     <w:rPr>
       <w:rFonts w:asciiTheme="majorHAnsi" w:hAnsiTheme="majorHAnsi" w:eastAsiaTheme="majorEastAsia" w:cstheme="majorBidi"/>
@@ -19413,6 +19751,7 @@
     <w:name w:val="Subtitle Char"/>
     <w:basedOn w:val="11"/>
     <w:link w:val="34"/>
+    <w:qFormat/>
     <w:uiPriority w:val="11"/>
     <w:rPr>
       <w:rFonts w:asciiTheme="majorHAnsi" w:hAnsiTheme="majorHAnsi" w:eastAsiaTheme="majorEastAsia" w:cstheme="majorBidi"/>
@@ -19443,18 +19782,21 @@
     <w:name w:val="Body Text Char"/>
     <w:basedOn w:val="11"/>
     <w:link w:val="13"/>
+    <w:qFormat/>
     <w:uiPriority w:val="99"/>
   </w:style>
   <w:style w:type="character" w:customStyle="1" w:styleId="145">
     <w:name w:val="Body Text 2 Char"/>
     <w:basedOn w:val="11"/>
     <w:link w:val="14"/>
+    <w:qFormat/>
     <w:uiPriority w:val="99"/>
   </w:style>
   <w:style w:type="character" w:customStyle="1" w:styleId="146">
     <w:name w:val="Body Text 3 Char"/>
     <w:basedOn w:val="11"/>
     <w:link w:val="15"/>
+    <w:qFormat/>
     <w:uiPriority w:val="99"/>
     <w:rPr>
       <w:sz w:val="16"/>
@@ -19465,6 +19807,7 @@
     <w:name w:val="Macro Text Char"/>
     <w:basedOn w:val="11"/>
     <w:link w:val="32"/>
+    <w:qFormat/>
     <w:uiPriority w:val="99"/>
     <w:rPr>
       <w:rFonts w:ascii="Courier" w:hAnsi="Courier"/>
@@ -19494,6 +19837,7 @@
     <w:name w:val="Quote Char"/>
     <w:basedOn w:val="11"/>
     <w:link w:val="148"/>
+    <w:qFormat/>
     <w:uiPriority w:val="29"/>
     <w:rPr>
       <w:i/>
@@ -19511,6 +19855,7 @@
     <w:basedOn w:val="11"/>
     <w:link w:val="5"/>
     <w:semiHidden/>
+    <w:qFormat/>
     <w:uiPriority w:val="9"/>
     <w:rPr>
       <w:rFonts w:asciiTheme="majorHAnsi" w:hAnsiTheme="majorHAnsi" w:eastAsiaTheme="majorEastAsia" w:cstheme="majorBidi"/>
@@ -19531,6 +19876,7 @@
     <w:basedOn w:val="11"/>
     <w:link w:val="6"/>
     <w:semiHidden/>
+    <w:qFormat/>
     <w:uiPriority w:val="9"/>
     <w:rPr>
       <w:rFonts w:asciiTheme="majorHAnsi" w:hAnsiTheme="majorHAnsi" w:eastAsiaTheme="majorEastAsia" w:cstheme="majorBidi"/>
@@ -19542,6 +19888,7 @@
     <w:basedOn w:val="11"/>
     <w:link w:val="7"/>
     <w:semiHidden/>
+    <w:qFormat/>
     <w:uiPriority w:val="9"/>
     <w:rPr>
       <w:rFonts w:asciiTheme="majorHAnsi" w:hAnsiTheme="majorHAnsi" w:eastAsiaTheme="majorEastAsia" w:cstheme="majorBidi"/>
@@ -19555,6 +19902,7 @@
     <w:basedOn w:val="11"/>
     <w:link w:val="8"/>
     <w:semiHidden/>
+    <w:qFormat/>
     <w:uiPriority w:val="9"/>
     <w:rPr>
       <w:rFonts w:asciiTheme="majorHAnsi" w:hAnsiTheme="majorHAnsi" w:eastAsiaTheme="majorEastAsia" w:cstheme="majorBidi"/>
@@ -19576,6 +19924,7 @@
     <w:basedOn w:val="11"/>
     <w:link w:val="9"/>
     <w:semiHidden/>
+    <w:qFormat/>
     <w:uiPriority w:val="9"/>
     <w:rPr>
       <w:rFonts w:asciiTheme="majorHAnsi" w:hAnsiTheme="majorHAnsi" w:eastAsiaTheme="majorEastAsia" w:cstheme="majorBidi"/>
@@ -19594,6 +19943,7 @@
     <w:basedOn w:val="11"/>
     <w:link w:val="10"/>
     <w:semiHidden/>
+    <w:qFormat/>
     <w:uiPriority w:val="9"/>
     <w:rPr>
       <w:rFonts w:asciiTheme="majorHAnsi" w:hAnsiTheme="majorHAnsi" w:eastAsiaTheme="majorEastAsia" w:cstheme="majorBidi"/>
@@ -19643,6 +19993,7 @@
     <w:name w:val="Intense Quote Char"/>
     <w:basedOn w:val="11"/>
     <w:link w:val="156"/>
+    <w:qFormat/>
     <w:uiPriority w:val="30"/>
     <w:rPr>
       <w:b/>
@@ -19756,6 +20107,7 @@
   <w:style w:type="paragraph" w:customStyle="1" w:styleId="164">
     <w:name w:val="Body Small"/>
     <w:basedOn w:val="1"/>
+    <w:qFormat/>
     <w:uiPriority w:val="0"/>
     <w:pPr>
       <w:spacing w:after="80" w:line="259" w:lineRule="auto"/>
@@ -19769,6 +20121,7 @@
   <w:style w:type="paragraph" w:customStyle="1" w:styleId="165">
     <w:name w:val="Section Heading"/>
     <w:basedOn w:val="1"/>
+    <w:qFormat/>
     <w:uiPriority w:val="0"/>
     <w:pPr>
       <w:keepNext/>
@@ -19784,6 +20137,7 @@
   <w:style w:type="paragraph" w:customStyle="1" w:styleId="166">
     <w:name w:val="Subsection Heading"/>
     <w:basedOn w:val="1"/>
+    <w:qFormat/>
     <w:uiPriority w:val="0"/>
     <w:pPr>
       <w:keepNext/>
@@ -19799,6 +20153,7 @@
   <w:style w:type="paragraph" w:customStyle="1" w:styleId="167">
     <w:name w:val="Reference"/>
     <w:basedOn w:val="1"/>
+    <w:qFormat/>
     <w:uiPriority w:val="0"/>
     <w:pPr>
       <w:spacing w:after="60" w:line="240" w:lineRule="auto"/>

</xml_diff>